<commit_message>
Complete three-entity exam center for defense
</commit_message>
<xml_diff>
--- a/Ответы к защите Экзаменационный центр.docx
+++ b/Ответы к защите Экзаменационный центр.docx
@@ -7,63 +7,47 @@
         <w:pStyle w:val="Title"/>
       </w:pPr>
       <w:r>
-        <w:t>Ответы к защите проекта Экзаменационный центр</w:t>
+        <w:t>Ответы к защите Экзаменационный центр</w:t>
       </w:r>
     </w:p>
     <w:p>
-      <w:pPr>
-        <w:keepNext w:val="0"/>
-        <w:spacing w:after="200"/>
-      </w:pPr>
       <w:r>
-        <w:t>Контрольная работа 1. Основная сущность — заявка на экзамен.</w:t>
+        <w:t>Проверка требований преподавателя и сценарий показа для трёх участников</w:t>
       </w:r>
     </w:p>
     <w:p>
-      <w:pPr>
-        <w:keepNext w:val="0"/>
-      </w:pPr>
       <w:r>
-        <w:t>Памятка отвечает на все вопросы из раздела ТЗ «На защите необходимо уметь объяснить». Примеры относятся к текущему Java-проекту: консольное меню → единый сервис → JDBC-репозиторий → PostgreSQL. Экспорт в Excel выполняется через Apache POI.</w:t>
+        <w:t>Проект соответствует объявленной комплектности: три сущности для команды из трёх человек, полный набор операций по каждой сущности, PostgreSQL, Excel, ООП и настроенный pom.xml. На защите каждому участнику нужно открыть свой раздел меню и показать цепочку «модель → сервис → репозиторий → таблица».</w:t>
       </w:r>
     </w:p>
     <w:p>
       <w:pPr>
         <w:pStyle w:val="Heading1"/>
-        <w:pageBreakBefore w:val="0"/>
       </w:pPr>
       <w:r>
-        <w:t>1 Назначение основных классов</w:t>
-      </w:r>
-    </w:p>
-    <w:p>
-      <w:pPr>
-        <w:keepNext w:val="0"/>
-      </w:pPr>
-      <w:r>
-        <w:t>Каждый слой отвечает за свою задачу. Поэтому изменение меню не требует переписывать SQL, а бизнес-правила собраны в одном сервисе.</w:t>
+        <w:t>Что показать по каждому пункту</w:t>
       </w:r>
     </w:p>
     <w:tbl>
       <w:tblPr>
         <w:tblW w:type="auto" w:w="0"/>
-        <w:jc w:val="center"/>
         <w:tblLayout w:type="fixed"/>
         <w:tblLook w:firstColumn="1" w:firstRow="1" w:lastColumn="0" w:lastRow="0" w:noHBand="0" w:noVBand="1" w:val="04A0"/>
       </w:tblPr>
       <w:tblGrid>
-        <w:gridCol w:w="2835"/>
-        <w:gridCol w:w="6576"/>
+        <w:gridCol w:w="2952"/>
+        <w:gridCol w:w="6941"/>
       </w:tblGrid>
       <w:tr>
         <w:trPr>
+          <w:cantSplit/>
           <w:tblHeader w:val="true"/>
         </w:trPr>
         <w:tc>
           <w:tcPr>
-            <w:tcW w:type="dxa" w:w="2835"/>
+            <w:tcW w:type="dxa" w:w="2952"/>
+            <w:vAlign w:val="center"/>
             <w:shd w:fill="263A5A"/>
-            <w:vAlign w:val="center"/>
             <w:tcBorders>
               <w:top w:val="single" w:sz="4" w:color="D9D9D9"/>
               <w:left w:val="single" w:sz="4" w:color="D9D9D9"/>
@@ -71,15 +55,15 @@
               <w:right w:val="single" w:sz="4" w:color="D9D9D9"/>
             </w:tcBorders>
             <w:tcMar>
-              <w:top w:w="105" w:type="dxa"/>
-              <w:bottom w:w="105" w:type="dxa"/>
-              <w:left w:w="125" w:type="dxa"/>
-              <w:right w:w="125" w:type="dxa"/>
+              <w:top w:w="55" w:type="dxa"/>
+              <w:bottom w:w="55" w:type="dxa"/>
+              <w:left w:w="100" w:type="dxa"/>
+              <w:right w:w="100" w:type="dxa"/>
             </w:tcMar>
           </w:tcPr>
           <w:p>
             <w:pPr>
-              <w:spacing w:after="0" w:line="269" w:lineRule="auto"/>
+              <w:spacing w:after="0" w:line="254" w:lineRule="auto"/>
             </w:pPr>
             <w:r>
               <w:rPr>
@@ -88,15 +72,15 @@
                 <w:color w:val="FFFFFF"/>
                 <w:sz w:val="18"/>
               </w:rPr>
-              <w:t>Класс или группа</w:t>
+              <w:t>Требование</w:t>
             </w:r>
           </w:p>
         </w:tc>
         <w:tc>
           <w:tcPr>
-            <w:tcW w:type="dxa" w:w="6576"/>
+            <w:tcW w:type="dxa" w:w="6941"/>
+            <w:vAlign w:val="center"/>
             <w:shd w:fill="263A5A"/>
-            <w:vAlign w:val="center"/>
             <w:tcBorders>
               <w:top w:val="single" w:sz="4" w:color="D9D9D9"/>
               <w:left w:val="single" w:sz="4" w:color="D9D9D9"/>
@@ -104,15 +88,15 @@
               <w:right w:val="single" w:sz="4" w:color="D9D9D9"/>
             </w:tcBorders>
             <w:tcMar>
-              <w:top w:w="105" w:type="dxa"/>
-              <w:bottom w:w="105" w:type="dxa"/>
-              <w:left w:w="125" w:type="dxa"/>
-              <w:right w:w="125" w:type="dxa"/>
+              <w:top w:w="55" w:type="dxa"/>
+              <w:bottom w:w="55" w:type="dxa"/>
+              <w:left w:w="100" w:type="dxa"/>
+              <w:right w:w="100" w:type="dxa"/>
             </w:tcMar>
           </w:tcPr>
           <w:p>
             <w:pPr>
-              <w:spacing w:after="0" w:line="269" w:lineRule="auto"/>
+              <w:spacing w:after="0" w:line="254" w:lineRule="auto"/>
             </w:pPr>
             <w:r>
               <w:rPr>
@@ -121,16 +105,20 @@
                 <w:color w:val="FFFFFF"/>
                 <w:sz w:val="18"/>
               </w:rPr>
-              <w:t>Назначение в проекте</w:t>
+              <w:t>Где показать</w:t>
             </w:r>
           </w:p>
         </w:tc>
       </w:tr>
       <w:tr>
+        <w:trPr>
+          <w:cantSplit/>
+        </w:trPr>
         <w:tc>
           <w:tcPr>
-            <w:tcW w:type="dxa" w:w="2835"/>
+            <w:tcW w:type="dxa" w:w="2952"/>
             <w:vAlign w:val="center"/>
+            <w:shd w:fill="FFFFFF"/>
             <w:tcBorders>
               <w:top w:val="single" w:sz="4" w:color="D9D9D9"/>
               <w:left w:val="single" w:sz="4" w:color="D9D9D9"/>
@@ -138,22 +126,32 @@
               <w:right w:val="single" w:sz="4" w:color="D9D9D9"/>
             </w:tcBorders>
             <w:tcMar>
-              <w:top w:w="105" w:type="dxa"/>
-              <w:bottom w:w="105" w:type="dxa"/>
-              <w:left w:w="125" w:type="dxa"/>
-              <w:right w:w="125" w:type="dxa"/>
+              <w:top w:w="55" w:type="dxa"/>
+              <w:bottom w:w="55" w:type="dxa"/>
+              <w:left w:w="100" w:type="dxa"/>
+              <w:right w:w="100" w:type="dxa"/>
             </w:tcMar>
           </w:tcPr>
           <w:p>
+            <w:pPr>
+              <w:spacing w:after="0" w:line="254" w:lineRule="auto"/>
+            </w:pPr>
             <w:r>
-              <w:t>Main</w:t>
+              <w:rPr>
+                <w:rFonts w:ascii="Arial" w:hAnsi="Arial"/>
+                <w:b w:val="0"/>
+                <w:color w:val="000000"/>
+                <w:sz w:val="18"/>
+              </w:rPr>
+              <w:t>Модель и ООП</w:t>
             </w:r>
           </w:p>
         </w:tc>
         <w:tc>
           <w:tcPr>
-            <w:tcW w:type="dxa" w:w="6576"/>
+            <w:tcW w:type="dxa" w:w="6941"/>
             <w:vAlign w:val="center"/>
+            <w:shd w:fill="FFFFFF"/>
             <w:tcBorders>
               <w:top w:val="single" w:sz="4" w:color="D9D9D9"/>
               <w:left w:val="single" w:sz="4" w:color="D9D9D9"/>
@@ -161,25 +159,37 @@
               <w:right w:val="single" w:sz="4" w:color="D9D9D9"/>
             </w:tcBorders>
             <w:tcMar>
-              <w:top w:w="105" w:type="dxa"/>
-              <w:bottom w:w="105" w:type="dxa"/>
-              <w:left w:w="125" w:type="dxa"/>
-              <w:right w:w="125" w:type="dxa"/>
+              <w:top w:w="55" w:type="dxa"/>
+              <w:bottom w:w="55" w:type="dxa"/>
+              <w:left w:w="100" w:type="dxa"/>
+              <w:right w:w="100" w:type="dxa"/>
             </w:tcMar>
           </w:tcPr>
           <w:p>
+            <w:pPr>
+              <w:spacing w:after="0" w:line="254" w:lineRule="auto"/>
+            </w:pPr>
             <w:r>
-              <w:t>Проверяет подключение, связывает сервис с репозиторием и запускает меню.</w:t>
+              <w:rPr>
+                <w:rFonts w:ascii="Arial" w:hAnsi="Arial"/>
+                <w:b w:val="0"/>
+                <w:color w:val="000000"/>
+                <w:sz w:val="18"/>
+              </w:rPr>
+              <w:t>model/Applicant, ExamApplication или Examiner: private-поля, конструктор, геттеры и сеттеры.</w:t>
             </w:r>
           </w:p>
         </w:tc>
       </w:tr>
       <w:tr>
+        <w:trPr>
+          <w:cantSplit/>
+        </w:trPr>
         <w:tc>
           <w:tcPr>
-            <w:tcW w:type="dxa" w:w="2835"/>
-            <w:shd w:fill="F4F7FA"/>
+            <w:tcW w:type="dxa" w:w="2952"/>
             <w:vAlign w:val="center"/>
+            <w:shd w:fill="F2F5F9"/>
             <w:tcBorders>
               <w:top w:val="single" w:sz="4" w:color="D9D9D9"/>
               <w:left w:val="single" w:sz="4" w:color="D9D9D9"/>
@@ -187,23 +197,32 @@
               <w:right w:val="single" w:sz="4" w:color="D9D9D9"/>
             </w:tcBorders>
             <w:tcMar>
-              <w:top w:w="105" w:type="dxa"/>
-              <w:bottom w:w="105" w:type="dxa"/>
-              <w:left w:w="125" w:type="dxa"/>
-              <w:right w:w="125" w:type="dxa"/>
+              <w:top w:w="55" w:type="dxa"/>
+              <w:bottom w:w="55" w:type="dxa"/>
+              <w:left w:w="100" w:type="dxa"/>
+              <w:right w:w="100" w:type="dxa"/>
             </w:tcMar>
           </w:tcPr>
           <w:p>
+            <w:pPr>
+              <w:spacing w:after="0" w:line="254" w:lineRule="auto"/>
+            </w:pPr>
             <w:r>
-              <w:t>ConsoleUi</w:t>
+              <w:rPr>
+                <w:rFonts w:ascii="Arial" w:hAnsi="Arial"/>
+                <w:b w:val="0"/>
+                <w:color w:val="000000"/>
+                <w:sz w:val="18"/>
+              </w:rPr>
+              <w:t>Репозиторий</w:t>
             </w:r>
           </w:p>
         </w:tc>
         <w:tc>
           <w:tcPr>
-            <w:tcW w:type="dxa" w:w="6576"/>
-            <w:shd w:fill="F4F7FA"/>
+            <w:tcW w:type="dxa" w:w="6941"/>
             <w:vAlign w:val="center"/>
+            <w:shd w:fill="F2F5F9"/>
             <w:tcBorders>
               <w:top w:val="single" w:sz="4" w:color="D9D9D9"/>
               <w:left w:val="single" w:sz="4" w:color="D9D9D9"/>
@@ -211,24 +230,37 @@
               <w:right w:val="single" w:sz="4" w:color="D9D9D9"/>
             </w:tcBorders>
             <w:tcMar>
-              <w:top w:w="105" w:type="dxa"/>
-              <w:bottom w:w="105" w:type="dxa"/>
-              <w:left w:w="125" w:type="dxa"/>
-              <w:right w:w="125" w:type="dxa"/>
+              <w:top w:w="55" w:type="dxa"/>
+              <w:bottom w:w="55" w:type="dxa"/>
+              <w:left w:w="100" w:type="dxa"/>
+              <w:right w:w="100" w:type="dxa"/>
             </w:tcMar>
           </w:tcPr>
           <w:p>
+            <w:pPr>
+              <w:spacing w:after="0" w:line="254" w:lineRule="auto"/>
+            </w:pPr>
             <w:r>
-              <w:t>Показывает меню, читает ввод и сообщает об ошибках.</w:t>
+              <w:rPr>
+                <w:rFonts w:ascii="Arial" w:hAnsi="Arial"/>
+                <w:b w:val="0"/>
+                <w:color w:val="000000"/>
+                <w:sz w:val="18"/>
+              </w:rPr>
+              <w:t>repository/*Repository.java: INSERT, SELECT, UPDATE, DELETE через JDBC и PreparedStatement.</w:t>
             </w:r>
           </w:p>
         </w:tc>
       </w:tr>
       <w:tr>
+        <w:trPr>
+          <w:cantSplit/>
+        </w:trPr>
         <w:tc>
           <w:tcPr>
-            <w:tcW w:type="dxa" w:w="2835"/>
+            <w:tcW w:type="dxa" w:w="2952"/>
             <w:vAlign w:val="center"/>
+            <w:shd w:fill="FFFFFF"/>
             <w:tcBorders>
               <w:top w:val="single" w:sz="4" w:color="D9D9D9"/>
               <w:left w:val="single" w:sz="4" w:color="D9D9D9"/>
@@ -236,22 +268,32 @@
               <w:right w:val="single" w:sz="4" w:color="D9D9D9"/>
             </w:tcBorders>
             <w:tcMar>
-              <w:top w:w="105" w:type="dxa"/>
-              <w:bottom w:w="105" w:type="dxa"/>
-              <w:left w:w="125" w:type="dxa"/>
-              <w:right w:w="125" w:type="dxa"/>
+              <w:top w:w="55" w:type="dxa"/>
+              <w:bottom w:w="55" w:type="dxa"/>
+              <w:left w:w="100" w:type="dxa"/>
+              <w:right w:w="100" w:type="dxa"/>
             </w:tcMar>
           </w:tcPr>
           <w:p>
+            <w:pPr>
+              <w:spacing w:after="0" w:line="254" w:lineRule="auto"/>
+            </w:pPr>
             <w:r>
-              <w:t>Applicant и ExamApplication</w:t>
+              <w:rPr>
+                <w:rFonts w:ascii="Arial" w:hAnsi="Arial"/>
+                <w:b w:val="0"/>
+                <w:color w:val="000000"/>
+                <w:sz w:val="18"/>
+              </w:rPr>
+              <w:t>Сервис и CRUD</w:t>
             </w:r>
           </w:p>
         </w:tc>
         <w:tc>
           <w:tcPr>
-            <w:tcW w:type="dxa" w:w="6576"/>
+            <w:tcW w:type="dxa" w:w="6941"/>
             <w:vAlign w:val="center"/>
+            <w:shd w:fill="FFFFFF"/>
             <w:tcBorders>
               <w:top w:val="single" w:sz="4" w:color="D9D9D9"/>
               <w:left w:val="single" w:sz="4" w:color="D9D9D9"/>
@@ -259,25 +301,37 @@
               <w:right w:val="single" w:sz="4" w:color="D9D9D9"/>
             </w:tcBorders>
             <w:tcMar>
-              <w:top w:w="105" w:type="dxa"/>
-              <w:bottom w:w="105" w:type="dxa"/>
-              <w:left w:w="125" w:type="dxa"/>
-              <w:right w:w="125" w:type="dxa"/>
+              <w:top w:w="55" w:type="dxa"/>
+              <w:bottom w:w="55" w:type="dxa"/>
+              <w:left w:w="100" w:type="dxa"/>
+              <w:right w:w="100" w:type="dxa"/>
             </w:tcMar>
           </w:tcPr>
           <w:p>
+            <w:pPr>
+              <w:spacing w:after="0" w:line="254" w:lineRule="auto"/>
+            </w:pPr>
             <w:r>
-              <w:t>Хранят данные кандидата и заявки; поля private final.</w:t>
+              <w:rPr>
+                <w:rFonts w:ascii="Arial" w:hAnsi="Arial"/>
+                <w:b w:val="0"/>
+                <w:color w:val="000000"/>
+                <w:sz w:val="18"/>
+              </w:rPr>
+              <w:t>service/*Service.java: проверка данных и вызов репозитория для четырёх операций.</w:t>
             </w:r>
           </w:p>
         </w:tc>
       </w:tr>
       <w:tr>
+        <w:trPr>
+          <w:cantSplit/>
+        </w:trPr>
         <w:tc>
           <w:tcPr>
-            <w:tcW w:type="dxa" w:w="2835"/>
-            <w:shd w:fill="F4F7FA"/>
+            <w:tcW w:type="dxa" w:w="2952"/>
             <w:vAlign w:val="center"/>
+            <w:shd w:fill="F2F5F9"/>
             <w:tcBorders>
               <w:top w:val="single" w:sz="4" w:color="D9D9D9"/>
               <w:left w:val="single" w:sz="4" w:color="D9D9D9"/>
@@ -285,23 +339,32 @@
               <w:right w:val="single" w:sz="4" w:color="D9D9D9"/>
             </w:tcBorders>
             <w:tcMar>
-              <w:top w:w="105" w:type="dxa"/>
-              <w:bottom w:w="105" w:type="dxa"/>
-              <w:left w:w="125" w:type="dxa"/>
-              <w:right w:w="125" w:type="dxa"/>
+              <w:top w:w="55" w:type="dxa"/>
+              <w:bottom w:w="55" w:type="dxa"/>
+              <w:left w:w="100" w:type="dxa"/>
+              <w:right w:w="100" w:type="dxa"/>
             </w:tcMar>
           </w:tcPr>
           <w:p>
+            <w:pPr>
+              <w:spacing w:after="0" w:line="254" w:lineRule="auto"/>
+            </w:pPr>
             <w:r>
-              <w:t>ApplicationStatus</w:t>
+              <w:rPr>
+                <w:rFonts w:ascii="Arial" w:hAnsi="Arial"/>
+                <w:b w:val="0"/>
+                <w:color w:val="000000"/>
+                <w:sz w:val="18"/>
+              </w:rPr>
+              <w:t>Enum</w:t>
             </w:r>
           </w:p>
         </w:tc>
         <w:tc>
           <w:tcPr>
-            <w:tcW w:type="dxa" w:w="6576"/>
-            <w:shd w:fill="F4F7FA"/>
+            <w:tcW w:type="dxa" w:w="6941"/>
             <w:vAlign w:val="center"/>
+            <w:shd w:fill="F2F5F9"/>
             <w:tcBorders>
               <w:top w:val="single" w:sz="4" w:color="D9D9D9"/>
               <w:left w:val="single" w:sz="4" w:color="D9D9D9"/>
@@ -309,24 +372,37 @@
               <w:right w:val="single" w:sz="4" w:color="D9D9D9"/>
             </w:tcBorders>
             <w:tcMar>
-              <w:top w:w="105" w:type="dxa"/>
-              <w:bottom w:w="105" w:type="dxa"/>
-              <w:left w:w="125" w:type="dxa"/>
-              <w:right w:w="125" w:type="dxa"/>
+              <w:top w:w="55" w:type="dxa"/>
+              <w:bottom w:w="55" w:type="dxa"/>
+              <w:left w:w="100" w:type="dxa"/>
+              <w:right w:w="100" w:type="dxa"/>
             </w:tcMar>
           </w:tcPr>
           <w:p>
+            <w:pPr>
+              <w:spacing w:after="0" w:line="254" w:lineRule="auto"/>
+            </w:pPr>
             <w:r>
-              <w:t>Перечисляет допустимые статусы заявки.</w:t>
+              <w:rPr>
+                <w:rFonts w:ascii="Arial" w:hAnsi="Arial"/>
+                <w:b w:val="0"/>
+                <w:color w:val="000000"/>
+                <w:sz w:val="18"/>
+              </w:rPr>
+              <w:t>ApplicantStatus, ApplicationStatus, ExaminerStatus — допустимые статусы.</w:t>
             </w:r>
           </w:p>
         </w:tc>
       </w:tr>
       <w:tr>
+        <w:trPr>
+          <w:cantSplit/>
+        </w:trPr>
         <w:tc>
           <w:tcPr>
-            <w:tcW w:type="dxa" w:w="2835"/>
+            <w:tcW w:type="dxa" w:w="2952"/>
             <w:vAlign w:val="center"/>
+            <w:shd w:fill="FFFFFF"/>
             <w:tcBorders>
               <w:top w:val="single" w:sz="4" w:color="D9D9D9"/>
               <w:left w:val="single" w:sz="4" w:color="D9D9D9"/>
@@ -334,22 +410,32 @@
               <w:right w:val="single" w:sz="4" w:color="D9D9D9"/>
             </w:tcBorders>
             <w:tcMar>
-              <w:top w:w="105" w:type="dxa"/>
-              <w:bottom w:w="105" w:type="dxa"/>
-              <w:left w:w="125" w:type="dxa"/>
-              <w:right w:w="125" w:type="dxa"/>
+              <w:top w:w="55" w:type="dxa"/>
+              <w:bottom w:w="55" w:type="dxa"/>
+              <w:left w:w="100" w:type="dxa"/>
+              <w:right w:w="100" w:type="dxa"/>
             </w:tcMar>
           </w:tcPr>
           <w:p>
+            <w:pPr>
+              <w:spacing w:after="0" w:line="254" w:lineRule="auto"/>
+            </w:pPr>
             <w:r>
-              <w:t>ExamCenterService</w:t>
+              <w:rPr>
+                <w:rFonts w:ascii="Arial" w:hAnsi="Arial"/>
+                <w:b w:val="0"/>
+                <w:color w:val="000000"/>
+                <w:sz w:val="18"/>
+              </w:rPr>
+              <w:t>Исключения</w:t>
             </w:r>
           </w:p>
         </w:tc>
         <w:tc>
           <w:tcPr>
-            <w:tcW w:type="dxa" w:w="6576"/>
+            <w:tcW w:type="dxa" w:w="6941"/>
             <w:vAlign w:val="center"/>
+            <w:shd w:fill="FFFFFF"/>
             <w:tcBorders>
               <w:top w:val="single" w:sz="4" w:color="D9D9D9"/>
               <w:left w:val="single" w:sz="4" w:color="D9D9D9"/>
@@ -357,25 +443,37 @@
               <w:right w:val="single" w:sz="4" w:color="D9D9D9"/>
             </w:tcBorders>
             <w:tcMar>
-              <w:top w:w="105" w:type="dxa"/>
-              <w:bottom w:w="105" w:type="dxa"/>
-              <w:left w:w="125" w:type="dxa"/>
-              <w:right w:w="125" w:type="dxa"/>
+              <w:top w:w="55" w:type="dxa"/>
+              <w:bottom w:w="55" w:type="dxa"/>
+              <w:left w:w="100" w:type="dxa"/>
+              <w:right w:w="100" w:type="dxa"/>
             </w:tcMar>
           </w:tcPr>
           <w:p>
+            <w:pPr>
+              <w:spacing w:after="0" w:line="254" w:lineRule="auto"/>
+            </w:pPr>
             <w:r>
-              <w:t>Проверяет правила, выполняет CRUD, поиск, фильтрацию, сортировку и статистику.</w:t>
+              <w:rPr>
+                <w:rFonts w:ascii="Arial" w:hAnsi="Arial"/>
+                <w:b w:val="0"/>
+                <w:color w:val="000000"/>
+                <w:sz w:val="18"/>
+              </w:rPr>
+              <w:t>Внутренний класс *Exception в каждом сервисе; ConsoleUi выводит сообщение и продолжает работу.</w:t>
             </w:r>
           </w:p>
         </w:tc>
       </w:tr>
       <w:tr>
+        <w:trPr>
+          <w:cantSplit/>
+        </w:trPr>
         <w:tc>
           <w:tcPr>
-            <w:tcW w:type="dxa" w:w="2835"/>
-            <w:shd w:fill="F4F7FA"/>
+            <w:tcW w:type="dxa" w:w="2952"/>
             <w:vAlign w:val="center"/>
+            <w:shd w:fill="F2F5F9"/>
             <w:tcBorders>
               <w:top w:val="single" w:sz="4" w:color="D9D9D9"/>
               <w:left w:val="single" w:sz="4" w:color="D9D9D9"/>
@@ -383,23 +481,32 @@
               <w:right w:val="single" w:sz="4" w:color="D9D9D9"/>
             </w:tcBorders>
             <w:tcMar>
-              <w:top w:w="105" w:type="dxa"/>
-              <w:bottom w:w="105" w:type="dxa"/>
-              <w:left w:w="125" w:type="dxa"/>
-              <w:right w:w="125" w:type="dxa"/>
+              <w:top w:w="55" w:type="dxa"/>
+              <w:bottom w:w="55" w:type="dxa"/>
+              <w:left w:w="100" w:type="dxa"/>
+              <w:right w:w="100" w:type="dxa"/>
             </w:tcMar>
           </w:tcPr>
           <w:p>
+            <w:pPr>
+              <w:spacing w:after="0" w:line="254" w:lineRule="auto"/>
+            </w:pPr>
             <w:r>
-              <w:t>ExamCenterRepository</w:t>
+              <w:rPr>
+                <w:rFonts w:ascii="Arial" w:hAnsi="Arial"/>
+                <w:b w:val="0"/>
+                <w:color w:val="000000"/>
+                <w:sz w:val="18"/>
+              </w:rPr>
+              <w:t>Сортировка</w:t>
             </w:r>
           </w:p>
         </w:tc>
         <w:tc>
           <w:tcPr>
-            <w:tcW w:type="dxa" w:w="6576"/>
-            <w:shd w:fill="F4F7FA"/>
+            <w:tcW w:type="dxa" w:w="6941"/>
             <w:vAlign w:val="center"/>
+            <w:shd w:fill="F2F5F9"/>
             <w:tcBorders>
               <w:top w:val="single" w:sz="4" w:color="D9D9D9"/>
               <w:left w:val="single" w:sz="4" w:color="D9D9D9"/>
@@ -407,24 +514,37 @@
               <w:right w:val="single" w:sz="4" w:color="D9D9D9"/>
             </w:tcBorders>
             <w:tcMar>
-              <w:top w:w="105" w:type="dxa"/>
-              <w:bottom w:w="105" w:type="dxa"/>
-              <w:left w:w="125" w:type="dxa"/>
-              <w:right w:w="125" w:type="dxa"/>
+              <w:top w:w="55" w:type="dxa"/>
+              <w:bottom w:w="55" w:type="dxa"/>
+              <w:left w:w="100" w:type="dxa"/>
+              <w:right w:w="100" w:type="dxa"/>
             </w:tcMar>
           </w:tcPr>
           <w:p>
+            <w:pPr>
+              <w:spacing w:after="0" w:line="254" w:lineRule="auto"/>
+            </w:pPr>
             <w:r>
-              <w:t>Читает и изменяет обе таблицы PostgreSQL через JDBC; создает Connection.</w:t>
+              <w:rPr>
+                <w:rFonts w:ascii="Arial" w:hAnsi="Arial"/>
+                <w:b w:val="0"/>
+                <w:color w:val="000000"/>
+                <w:sz w:val="18"/>
+              </w:rPr>
+              <w:t>Методы sortByName/Email, sortByDate/Applicant, sortByName/Subject с аргументом ascending.</w:t>
             </w:r>
           </w:p>
         </w:tc>
       </w:tr>
       <w:tr>
+        <w:trPr>
+          <w:cantSplit/>
+        </w:trPr>
         <w:tc>
           <w:tcPr>
-            <w:tcW w:type="dxa" w:w="2835"/>
+            <w:tcW w:type="dxa" w:w="2952"/>
             <w:vAlign w:val="center"/>
+            <w:shd w:fill="FFFFFF"/>
             <w:tcBorders>
               <w:top w:val="single" w:sz="4" w:color="D9D9D9"/>
               <w:left w:val="single" w:sz="4" w:color="D9D9D9"/>
@@ -432,1280 +552,21 @@
               <w:right w:val="single" w:sz="4" w:color="D9D9D9"/>
             </w:tcBorders>
             <w:tcMar>
-              <w:top w:w="105" w:type="dxa"/>
-              <w:bottom w:w="105" w:type="dxa"/>
-              <w:left w:w="125" w:type="dxa"/>
-              <w:right w:w="125" w:type="dxa"/>
-            </w:tcMar>
-          </w:tcPr>
-          <w:p>
-            <w:r>
-              <w:t>DataExporter и XlsxExporter</w:t>
-            </w:r>
-          </w:p>
-        </w:tc>
-        <w:tc>
-          <w:tcPr>
-            <w:tcW w:type="dxa" w:w="6576"/>
-            <w:vAlign w:val="center"/>
-            <w:tcBorders>
-              <w:top w:val="single" w:sz="4" w:color="D9D9D9"/>
-              <w:left w:val="single" w:sz="4" w:color="D9D9D9"/>
-              <w:bottom w:val="single" w:sz="4" w:color="D9D9D9"/>
-              <w:right w:val="single" w:sz="4" w:color="D9D9D9"/>
-            </w:tcBorders>
-            <w:tcMar>
-              <w:top w:w="105" w:type="dxa"/>
-              <w:bottom w:w="105" w:type="dxa"/>
-              <w:left w:w="125" w:type="dxa"/>
-              <w:right w:w="125" w:type="dxa"/>
-            </w:tcMar>
-          </w:tcPr>
-          <w:p>
-            <w:r>
-              <w:t>Задают контракт экспорта и создают файл Excel через Apache POI.</w:t>
-            </w:r>
-          </w:p>
-        </w:tc>
-      </w:tr>
-      <w:tr>
-        <w:tc>
-          <w:tcPr>
-            <w:tcW w:type="dxa" w:w="2835"/>
-            <w:shd w:fill="F4F7FA"/>
-            <w:vAlign w:val="center"/>
-            <w:tcBorders>
-              <w:top w:val="single" w:sz="4" w:color="D9D9D9"/>
-              <w:left w:val="single" w:sz="4" w:color="D9D9D9"/>
-              <w:bottom w:val="single" w:sz="4" w:color="D9D9D9"/>
-              <w:right w:val="single" w:sz="4" w:color="D9D9D9"/>
-            </w:tcBorders>
-            <w:tcMar>
-              <w:top w:w="105" w:type="dxa"/>
-              <w:bottom w:w="105" w:type="dxa"/>
-              <w:left w:w="125" w:type="dxa"/>
-              <w:right w:w="125" w:type="dxa"/>
-            </w:tcMar>
-          </w:tcPr>
-          <w:p>
-            <w:r>
-              <w:t>BusinessException</w:t>
-            </w:r>
-          </w:p>
-        </w:tc>
-        <w:tc>
-          <w:tcPr>
-            <w:tcW w:type="dxa" w:w="6576"/>
-            <w:shd w:fill="F4F7FA"/>
-            <w:vAlign w:val="center"/>
-            <w:tcBorders>
-              <w:top w:val="single" w:sz="4" w:color="D9D9D9"/>
-              <w:left w:val="single" w:sz="4" w:color="D9D9D9"/>
-              <w:bottom w:val="single" w:sz="4" w:color="D9D9D9"/>
-              <w:right w:val="single" w:sz="4" w:color="D9D9D9"/>
-            </w:tcBorders>
-            <w:tcMar>
-              <w:top w:w="105" w:type="dxa"/>
-              <w:bottom w:w="105" w:type="dxa"/>
-              <w:left w:w="125" w:type="dxa"/>
-              <w:right w:w="125" w:type="dxa"/>
-            </w:tcMar>
-          </w:tcPr>
-          <w:p>
-            <w:r>
-              <w:t>Описывает нарушение правила или отсутствие записи.</w:t>
-            </w:r>
-          </w:p>
-        </w:tc>
-      </w:tr>
-    </w:tbl>
-    <w:p>
-      <w:pPr>
-        <w:spacing w:after="0"/>
-      </w:pPr>
-    </w:p>
-    <w:p>
-      <w:pPr>
-        <w:keepNext w:val="0"/>
-      </w:pPr>
-      <w:r>
-        <w:t>Цепочка вызовов при создании заявки: ConsoleUi → ExamCenterService.createApplication() → ExamCenterRepository.createApplication() → таблица exam_applications.</w:t>
-      </w:r>
-    </w:p>
-    <w:p>
-      <w:pPr>
-        <w:pStyle w:val="Heading1"/>
-        <w:pageBreakBefore w:val="0"/>
-      </w:pPr>
-      <w:r>
-        <w:t>2 Инкапсуляция</w:t>
-      </w:r>
-    </w:p>
-    <w:p>
-      <w:pPr>
-        <w:keepNext w:val="0"/>
-      </w:pPr>
-      <w:r>
-        <w:t>Поля модели скрыты модификатором private и доступны через методы чтения. Объект заявки создается конструктором; произвольно менять его поля из ConsoleUi нельзя. Изменения проходят через сервис, где выполняются проверки.</w:t>
-      </w:r>
-    </w:p>
-    <w:p>
-      <w:pPr>
-        <w:pStyle w:val="Source"/>
-      </w:pPr>
-      <w:r>
-        <w:t>Пример: model/ExamApplication.java</w:t>
-      </w:r>
-    </w:p>
-    <w:p>
-      <w:pPr>
-        <w:pStyle w:val="Code"/>
-        <w:keepLines/>
-      </w:pPr>
-      <w:r>
-        <w:t>private final long id;</w:t>
-        <w:br/>
-        <w:t>private final ApplicationStatus status;</w:t>
-        <w:br/>
-        <w:t>public long getId() { return id; }</w:t>
-      </w:r>
-    </w:p>
-    <w:p>
-      <w:pPr>
-        <w:keepNext w:val="0"/>
-      </w:pPr>
-      <w:r>
-        <w:t>Дополнительный пример — private-поле repository в ExamCenterService: интерфейс не получает прямой доступ к SQL-операциям.</w:t>
-      </w:r>
-    </w:p>
-    <w:p>
-      <w:pPr>
-        <w:pStyle w:val="Heading1"/>
-        <w:pageBreakBefore w:val="0"/>
-      </w:pPr>
-      <w:r>
-        <w:t>3 Назначение интерфейса</w:t>
-      </w:r>
-    </w:p>
-    <w:p>
-      <w:pPr>
-        <w:keepNext/>
-      </w:pPr>
-      <w:r>
-        <w:t>DataExporter задает единый способ экспорта двух списков в файл. XlsxExporter реализует этот контракт и записывает книгу .xlsx. Код меню работает с типом интерфейса, то есть зависит от операции export(), а не от внутреннего устройства Excel-файла.</w:t>
-      </w:r>
-    </w:p>
-    <w:p>
-      <w:pPr>
-        <w:pStyle w:val="Source"/>
-      </w:pPr>
-      <w:r>
-        <w:t>Пример: export/DataExporter.java</w:t>
-      </w:r>
-    </w:p>
-    <w:p>
-      <w:pPr>
-        <w:pStyle w:val="Code"/>
-        <w:keepLines/>
-      </w:pPr>
-      <w:r>
-        <w:t>public interface DataExporter {</w:t>
-        <w:br/>
-        <w:t xml:space="preserve">    void export(Path file, List&lt;Applicant&gt; applicants,</w:t>
-        <w:br/>
-        <w:t xml:space="preserve">                List&lt;ExamApplication&gt; applications) throws IOException;</w:t>
-        <w:br/>
-        <w:t>}</w:t>
-      </w:r>
-    </w:p>
-    <w:p>
-      <w:pPr>
-        <w:pStyle w:val="Heading1"/>
-        <w:pageBreakBefore w:val="0"/>
-      </w:pPr>
-      <w:r>
-        <w:t>4 Применение enum</w:t>
-      </w:r>
-    </w:p>
-    <w:p>
-      <w:pPr>
-        <w:keepNext w:val="0"/>
-      </w:pPr>
-      <w:r>
-        <w:t>ApplicationStatus представляет ограниченный набор состояний заявки. Это исключает произвольные строковые статусы внутри Java-модели и позволяет проверять переходы через сравнение констант. В БД этот же набор закреплен ограничением CHECK.</w:t>
-      </w:r>
-    </w:p>
-    <w:p>
-      <w:pPr>
-        <w:pStyle w:val="Source"/>
-      </w:pPr>
-      <w:r>
-        <w:t>Пример: model/ApplicationStatus.java</w:t>
-      </w:r>
-    </w:p>
-    <w:p>
-      <w:pPr>
-        <w:pStyle w:val="Code"/>
-        <w:keepLines/>
-      </w:pPr>
-      <w:r>
-        <w:t>public enum ApplicationStatus {</w:t>
-        <w:br/>
-        <w:t xml:space="preserve">    NEW, APPROVED, COMPLETED, CANCELLED</w:t>
-        <w:br/>
-        <w:t>}</w:t>
-      </w:r>
-    </w:p>
-    <w:p>
-      <w:pPr>
-        <w:keepNext w:val="0"/>
-      </w:pPr>
-      <w:r>
-        <w:t>Например, NEW можно перевести в APPROVED или CANCELLED; COMPLETED и CANCELLED являются конечными состояниями.</w:t>
-      </w:r>
-    </w:p>
-    <w:p>
-      <w:pPr>
-        <w:pStyle w:val="Heading1"/>
-        <w:pageBreakBefore w:val="0"/>
-      </w:pPr>
-      <w:r>
-        <w:t>5 Полиморфизм</w:t>
-      </w:r>
-    </w:p>
-    <w:p>
-      <w:pPr>
-        <w:keepNext w:val="0"/>
-      </w:pPr>
-      <w:r>
-        <w:t>В ConsoleUi поле имеет тип DataExporter, а присваивается объект XlsxExporter. При вызове export() выполняется реализация класса XlsxExporter. Это полиморфный вызов через интерфейс; в проекте он используется для экспорта.</w:t>
-      </w:r>
-    </w:p>
-    <w:p>
-      <w:pPr>
-        <w:pStyle w:val="Source"/>
-      </w:pPr>
-      <w:r>
-        <w:t>Пример: ui/ConsoleUi.java</w:t>
-      </w:r>
-    </w:p>
-    <w:p>
-      <w:pPr>
-        <w:pStyle w:val="Code"/>
-        <w:keepLines/>
-      </w:pPr>
-      <w:r>
-        <w:t>private final DataExporter exporter;</w:t>
-        <w:br/>
-        <w:t>this.exporter = new XlsxExporter();</w:t>
-        <w:br/>
-        <w:t>exporter.export(path, service.allApplicants(), service.allApplications());</w:t>
-      </w:r>
-    </w:p>
-    <w:p>
-      <w:pPr>
-        <w:keepNext w:val="0"/>
-      </w:pPr>
-      <w:r>
-        <w:t>Если появится другой формат экспорта, класс меню сможет вызывать тот же метод интерфейса. В текущей версии реализован только XlsxExporter.</w:t>
-      </w:r>
-    </w:p>
-    <w:p>
-      <w:pPr>
-        <w:pStyle w:val="Heading1"/>
-        <w:pageBreakBefore w:val="0"/>
-      </w:pPr>
-      <w:r>
-        <w:t>6 Использование коллекций</w:t>
-      </w:r>
-    </w:p>
-    <w:p>
-      <w:pPr>
-        <w:keepNext w:val="0"/>
-      </w:pPr>
-      <w:r>
-        <w:t>Репозиторий помещает строки ResultSet в ArrayList и возвращает List&lt;ExamApplication&gt; или List&lt;Applicant&gt;. Сервис применяет Stream API к этим спискам для поиска, фильтрации, сортировки и статистики.</w:t>
-      </w:r>
-    </w:p>
-    <w:p>
-      <w:pPr>
-        <w:pStyle w:val="Source"/>
-      </w:pPr>
-      <w:r>
-        <w:t>Пример: repository/ExamCenterRepository.java</w:t>
-      </w:r>
-    </w:p>
-    <w:p>
-      <w:pPr>
-        <w:pStyle w:val="Code"/>
-        <w:keepLines/>
-      </w:pPr>
-      <w:r>
-        <w:t>List&lt;ExamApplication&gt; result = new ArrayList&lt;&gt;();</w:t>
-        <w:br/>
-        <w:t>while (r.next()) result.add(application(r));</w:t>
-        <w:br/>
-        <w:t>return result;</w:t>
-      </w:r>
-    </w:p>
-    <w:p>
-      <w:pPr>
-        <w:keepNext w:val="0"/>
-      </w:pPr>
-      <w:r>
-        <w:t>Так демонстрируется Java Collections Framework. Исходные записи при этом хранятся в PostgreSQL, а список создается при чтении.</w:t>
-      </w:r>
-    </w:p>
-    <w:p>
-      <w:pPr>
-        <w:pStyle w:val="Heading1"/>
-        <w:pageBreakBefore w:val="0"/>
-      </w:pPr>
-      <w:r>
-        <w:t>7 Обработка исключений</w:t>
-      </w:r>
-    </w:p>
-    <w:p>
-      <w:pPr>
-        <w:keepNext w:val="0"/>
-      </w:pPr>
-      <w:r>
-        <w:t>BusinessException сообщает о нарушении правила: пустое название экзамена, прошедшая дата, дубликат активной заявки или запрещенный переход статуса. То же собственное исключение используется, когда запись с указанным ID не найдена. Неверное число преобразуется в понятное сообщение; SQLException и IOException обрабатываются отдельно.</w:t>
-      </w:r>
-    </w:p>
-    <w:p>
-      <w:pPr>
-        <w:pStyle w:val="Source"/>
-      </w:pPr>
-      <w:r>
-        <w:t>Пример: service/ExamCenterService.java</w:t>
-      </w:r>
-    </w:p>
-    <w:p>
-      <w:pPr>
-        <w:pStyle w:val="Code"/>
-        <w:keepLines/>
-      </w:pPr>
-      <w:r>
-        <w:t>return repository.findApplication(id)</w:t>
-        <w:br/>
-        <w:t xml:space="preserve">    .orElseThrow(() -&gt; new BusinessException(</w:t>
-        <w:br/>
-        <w:t xml:space="preserve">        "Заявка с ID " + id + " не найдена."));</w:t>
-      </w:r>
-    </w:p>
-    <w:p>
-      <w:pPr>
-        <w:keepNext w:val="0"/>
-      </w:pPr>
-      <w:r>
-        <w:t>ConsoleUi перехватывает ошибки и возвращается к меню. Connection, PreparedStatement и ResultSet закрываются автоматически через try-with-resources. Ошибки подключения при старте обрабатывает Main.</w:t>
-      </w:r>
-    </w:p>
-    <w:p>
-      <w:pPr>
-        <w:pStyle w:val="Heading1"/>
-        <w:pageBreakBefore w:val="0"/>
-      </w:pPr>
-      <w:r>
-        <w:t>8 Работа JDBC</w:t>
-      </w:r>
-    </w:p>
-    <w:p>
-      <w:pPr>
-        <w:keepNext w:val="0"/>
-      </w:pPr>
-      <w:r>
-        <w:t>JDBC связывает Java-приложение с PostgreSQL. ExamCenterRepository получает Connection через DriverManager.getConnection(), создает PreparedStatement, передает параметры, выполняет запрос и преобразует ResultSet в объект модели. Подключение задается переменными окружения, которые устанавливает run.sh.</w:t>
-      </w:r>
-    </w:p>
-    <w:p>
-      <w:pPr>
-        <w:pStyle w:val="Source"/>
-      </w:pPr>
-      <w:r>
-        <w:t>Пример: repository/ExamCenterRepository.java</w:t>
-      </w:r>
-    </w:p>
-    <w:p>
-      <w:pPr>
-        <w:pStyle w:val="Code"/>
-        <w:keepLines/>
-      </w:pPr>
-      <w:r>
-        <w:t>try (Connection c = connect();</w:t>
-        <w:br/>
-        <w:t xml:space="preserve">     PreparedStatement s = c.prepareStatement(</w:t>
-        <w:br/>
-        <w:t xml:space="preserve">         APPLICATION_SELECT + "WHERE e.id=?")) {</w:t>
-        <w:br/>
-        <w:t xml:space="preserve">    s.setLong(1, id);</w:t>
-        <w:br/>
-        <w:t xml:space="preserve">    try (ResultSet r = s.executeQuery()) { /* чтение заявки */ }</w:t>
-        <w:br/>
-        <w:t>}</w:t>
-      </w:r>
-    </w:p>
-    <w:p>
-      <w:pPr>
-        <w:keepNext w:val="0"/>
-      </w:pPr>
-      <w:r>
-        <w:t>При INSERT репозиторий запрашивает сгенерированный ключ и возвращает ID новой записи.</w:t>
-      </w:r>
-    </w:p>
-    <w:p>
-      <w:pPr>
-        <w:pStyle w:val="Heading1"/>
-        <w:pageBreakBefore w:val="0"/>
-      </w:pPr>
-      <w:r>
-        <w:t>9 Отличие Statement от PreparedStatement</w:t>
-      </w:r>
-    </w:p>
-    <w:p>
-      <w:pPr>
-        <w:keepNext w:val="0"/>
-      </w:pPr>
-      <w:r>
-        <w:t>Statement исполняет готовую строку SQL. PreparedStatement поддерживает параметры «?»: SQL остается отдельным от пользовательских значений, а тип параметра задается методом setLong, setString или setTimestamp. Это защищает от подстановки ввода в текст запроса и упрощает работу с типами.</w:t>
-      </w:r>
-    </w:p>
-    <w:p>
-      <w:pPr>
-        <w:pStyle w:val="Source"/>
-      </w:pPr>
-      <w:r>
-        <w:t>Пример: repository/ExamCenterRepository.java</w:t>
-      </w:r>
-    </w:p>
-    <w:p>
-      <w:pPr>
-        <w:pStyle w:val="Code"/>
-        <w:keepLines/>
-      </w:pPr>
-      <w:r>
-        <w:t>String sql = "DELETE FROM exam_applications WHERE id=?";</w:t>
-        <w:br/>
-        <w:t>PreparedStatement s = c.prepareStatement(sql);</w:t>
-        <w:br/>
-        <w:t>s.setLong(1, id);</w:t>
-        <w:br/>
-        <w:t>s.executeUpdate();</w:t>
-      </w:r>
-    </w:p>
-    <w:p>
-      <w:pPr>
-        <w:keepNext w:val="0"/>
-      </w:pPr>
-      <w:r>
-        <w:t>В нашем коде запросы выполняются через PreparedStatement. Имя Statement встречается в константе Statement.RETURN_GENERATED_KEYS: она лишь просит JDBC вернуть ID после INSERT, объект Statement для запросов не создается.</w:t>
-      </w:r>
-    </w:p>
-    <w:p>
-      <w:pPr>
-        <w:pStyle w:val="Heading1"/>
-        <w:pageBreakBefore/>
-      </w:pPr>
-      <w:r>
-        <w:t>10 Связь между таблицами</w:t>
-      </w:r>
-    </w:p>
-    <w:p>
-      <w:pPr>
-        <w:keepNext w:val="0"/>
-      </w:pPr>
-      <w:r>
-        <w:t>В схеме две таблицы: applicants и exam_applications. Один кандидат может иметь несколько заявок; каждая заявка указывает на одного кандидата через exam_applications.applicant_id → applicants.id. Это связь один ко многим.</w:t>
-      </w:r>
-    </w:p>
-    <w:p>
-      <w:pPr>
-        <w:keepLines/>
-        <w:jc w:val="center"/>
-      </w:pPr>
-      <w:r>
-        <w:drawing>
-          <wp:inline xmlns:a="http://schemas.openxmlformats.org/drawingml/2006/main" xmlns:pic="http://schemas.openxmlformats.org/drawingml/2006/picture">
-            <wp:extent cx="5580000" cy="2635000"/>
-            <wp:docPr id="1" name="Picture 1"/>
-            <wp:cNvGraphicFramePr>
-              <a:graphicFrameLocks noChangeAspect="1"/>
-            </wp:cNvGraphicFramePr>
-            <a:graphic>
-              <a:graphicData uri="http://schemas.openxmlformats.org/drawingml/2006/picture">
-                <pic:pic>
-                  <pic:nvPicPr>
-                    <pic:cNvPr id="0" name="exam-er-doc.png"/>
-                    <pic:cNvPicPr/>
-                  </pic:nvPicPr>
-                  <pic:blipFill>
-                    <a:blip r:embed="rId9"/>
-                    <a:stretch>
-                      <a:fillRect/>
-                    </a:stretch>
-                  </pic:blipFill>
-                  <pic:spPr>
-                    <a:xfrm>
-                      <a:off x="0" y="0"/>
-                      <a:ext cx="5580000" cy="2635000"/>
-                    </a:xfrm>
-                    <a:prstGeom prst="rect"/>
-                  </pic:spPr>
-                </pic:pic>
-              </a:graphicData>
-            </a:graphic>
-          </wp:inline>
-        </w:drawing>
-      </w:r>
-    </w:p>
-    <w:p>
-      <w:pPr>
-        <w:keepNext w:val="0"/>
-      </w:pPr>
-      <w:r>
-        <w:t>Первичные ключи — id в обеих таблицах. Внешний ключ запрещает ссылку на несуществующего кандидата и удаление кандидата при наличии его заявок (ON DELETE RESTRICT). Email уникален; частичный уникальный индекс запрещает две активные заявки одного кандидата на один экзамен и время. CHECK ограничивает статус и балл.</w:t>
-      </w:r>
-    </w:p>
-    <w:p>
-      <w:pPr>
-        <w:pStyle w:val="Heading1"/>
-        <w:pageBreakBefore w:val="0"/>
-      </w:pPr>
-      <w:r>
-        <w:t>11 Основные бизнес-правила</w:t>
-      </w:r>
-    </w:p>
-    <w:p>
-      <w:pPr>
-        <w:keepNext w:val="0"/>
-      </w:pPr>
-      <w:r>
-        <w:t>Правила находятся в сервисном слое, поэтому действуют независимо от того, вызвана операция из меню или из другого кода. Часть ограничений продублирована в SQL для защиты данных при прямой записи в БД.</w:t>
-      </w:r>
-    </w:p>
-    <w:tbl>
-      <w:tblPr>
-        <w:tblW w:type="auto" w:w="0"/>
-        <w:jc w:val="center"/>
-        <w:tblLayout w:type="fixed"/>
-        <w:tblLook w:firstColumn="1" w:firstRow="1" w:lastColumn="0" w:lastRow="0" w:noHBand="0" w:noVBand="1" w:val="04A0"/>
-      </w:tblPr>
-      <w:tblGrid>
-        <w:gridCol w:w="5102"/>
-        <w:gridCol w:w="4309"/>
-      </w:tblGrid>
-      <w:tr>
-        <w:trPr>
-          <w:tblHeader w:val="true"/>
-        </w:trPr>
-        <w:tc>
-          <w:tcPr>
-            <w:tcW w:type="dxa" w:w="5102"/>
-            <w:shd w:fill="263A5A"/>
-            <w:vAlign w:val="center"/>
-            <w:tcBorders>
-              <w:top w:val="single" w:sz="4" w:color="D9D9D9"/>
-              <w:left w:val="single" w:sz="4" w:color="D9D9D9"/>
-              <w:bottom w:val="single" w:sz="4" w:color="D9D9D9"/>
-              <w:right w:val="single" w:sz="4" w:color="D9D9D9"/>
-            </w:tcBorders>
-            <w:tcMar>
-              <w:top w:w="105" w:type="dxa"/>
-              <w:bottom w:w="105" w:type="dxa"/>
-              <w:left w:w="125" w:type="dxa"/>
-              <w:right w:w="125" w:type="dxa"/>
+              <w:top w:w="55" w:type="dxa"/>
+              <w:bottom w:w="55" w:type="dxa"/>
+              <w:left w:w="100" w:type="dxa"/>
+              <w:right w:w="100" w:type="dxa"/>
             </w:tcMar>
           </w:tcPr>
           <w:p>
             <w:pPr>
-              <w:spacing w:after="0" w:line="269" w:lineRule="auto"/>
+              <w:spacing w:after="0" w:line="254" w:lineRule="auto"/>
             </w:pPr>
             <w:r>
               <w:rPr>
                 <w:rFonts w:ascii="Arial" w:hAnsi="Arial"/>
-                <w:b/>
-                <w:color w:val="FFFFFF"/>
-                <w:sz w:val="18"/>
-              </w:rPr>
-              <w:t>Правило</w:t>
-            </w:r>
-          </w:p>
-        </w:tc>
-        <w:tc>
-          <w:tcPr>
-            <w:tcW w:type="dxa" w:w="4309"/>
-            <w:shd w:fill="263A5A"/>
-            <w:vAlign w:val="center"/>
-            <w:tcBorders>
-              <w:top w:val="single" w:sz="4" w:color="D9D9D9"/>
-              <w:left w:val="single" w:sz="4" w:color="D9D9D9"/>
-              <w:bottom w:val="single" w:sz="4" w:color="D9D9D9"/>
-              <w:right w:val="single" w:sz="4" w:color="D9D9D9"/>
-            </w:tcBorders>
-            <w:tcMar>
-              <w:top w:w="105" w:type="dxa"/>
-              <w:bottom w:w="105" w:type="dxa"/>
-              <w:left w:w="125" w:type="dxa"/>
-              <w:right w:w="125" w:type="dxa"/>
-            </w:tcMar>
-          </w:tcPr>
-          <w:p>
-            <w:pPr>
-              <w:spacing w:after="0" w:line="269" w:lineRule="auto"/>
-            </w:pPr>
-            <w:r>
-              <w:rPr>
-                <w:rFonts w:ascii="Arial" w:hAnsi="Arial"/>
-                <w:b/>
-                <w:color w:val="FFFFFF"/>
-                <w:sz w:val="18"/>
-              </w:rPr>
-              <w:t>Где проверяется</w:t>
-            </w:r>
-          </w:p>
-        </w:tc>
-      </w:tr>
-      <w:tr>
-        <w:tc>
-          <w:tcPr>
-            <w:tcW w:type="dxa" w:w="5102"/>
-            <w:vAlign w:val="center"/>
-            <w:tcBorders>
-              <w:top w:val="single" w:sz="4" w:color="D9D9D9"/>
-              <w:left w:val="single" w:sz="4" w:color="D9D9D9"/>
-              <w:bottom w:val="single" w:sz="4" w:color="D9D9D9"/>
-              <w:right w:val="single" w:sz="4" w:color="D9D9D9"/>
-            </w:tcBorders>
-            <w:tcMar>
-              <w:top w:w="105" w:type="dxa"/>
-              <w:bottom w:w="105" w:type="dxa"/>
-              <w:left w:w="125" w:type="dxa"/>
-              <w:right w:w="125" w:type="dxa"/>
-            </w:tcMar>
-          </w:tcPr>
-          <w:p>
-            <w:pPr>
-              <w:spacing w:after="0" w:line="269" w:lineRule="auto"/>
-            </w:pPr>
-            <w:r>
-              <w:rPr>
-                <w:rFonts w:ascii="Arial" w:hAnsi="Arial"/>
-                <w:color w:val="141C28"/>
-                <w:sz w:val="18"/>
-              </w:rPr>
-              <w:t>ФИО 2–120 символов, простой формат email и уникальность email.</w:t>
-            </w:r>
-          </w:p>
-        </w:tc>
-        <w:tc>
-          <w:tcPr>
-            <w:tcW w:type="dxa" w:w="4309"/>
-            <w:vAlign w:val="center"/>
-            <w:tcBorders>
-              <w:top w:val="single" w:sz="4" w:color="D9D9D9"/>
-              <w:left w:val="single" w:sz="4" w:color="D9D9D9"/>
-              <w:bottom w:val="single" w:sz="4" w:color="D9D9D9"/>
-              <w:right w:val="single" w:sz="4" w:color="D9D9D9"/>
-            </w:tcBorders>
-            <w:tcMar>
-              <w:top w:w="105" w:type="dxa"/>
-              <w:bottom w:w="105" w:type="dxa"/>
-              <w:left w:w="125" w:type="dxa"/>
-              <w:right w:w="125" w:type="dxa"/>
-            </w:tcMar>
-          </w:tcPr>
-          <w:p>
-            <w:r>
-              <w:t>createApplicant() в сервисе; UNIQUE для email в БД.</w:t>
-            </w:r>
-          </w:p>
-        </w:tc>
-      </w:tr>
-      <w:tr>
-        <w:tc>
-          <w:tcPr>
-            <w:tcW w:type="dxa" w:w="5102"/>
-            <w:shd w:fill="F4F7FA"/>
-            <w:vAlign w:val="center"/>
-            <w:tcBorders>
-              <w:top w:val="single" w:sz="4" w:color="D9D9D9"/>
-              <w:left w:val="single" w:sz="4" w:color="D9D9D9"/>
-              <w:bottom w:val="single" w:sz="4" w:color="D9D9D9"/>
-              <w:right w:val="single" w:sz="4" w:color="D9D9D9"/>
-            </w:tcBorders>
-            <w:tcMar>
-              <w:top w:w="105" w:type="dxa"/>
-              <w:bottom w:w="105" w:type="dxa"/>
-              <w:left w:w="125" w:type="dxa"/>
-              <w:right w:w="125" w:type="dxa"/>
-            </w:tcMar>
-          </w:tcPr>
-          <w:p>
-            <w:pPr>
-              <w:spacing w:after="0" w:line="269" w:lineRule="auto"/>
-            </w:pPr>
-            <w:r>
-              <w:rPr>
-                <w:rFonts w:ascii="Arial" w:hAnsi="Arial"/>
-                <w:color w:val="141C28"/>
-                <w:sz w:val="18"/>
-              </w:rPr>
-              <w:t>Заявка указывает на существующего кандидата.</w:t>
-            </w:r>
-          </w:p>
-        </w:tc>
-        <w:tc>
-          <w:tcPr>
-            <w:tcW w:type="dxa" w:w="4309"/>
-            <w:shd w:fill="F4F7FA"/>
-            <w:vAlign w:val="center"/>
-            <w:tcBorders>
-              <w:top w:val="single" w:sz="4" w:color="D9D9D9"/>
-              <w:left w:val="single" w:sz="4" w:color="D9D9D9"/>
-              <w:bottom w:val="single" w:sz="4" w:color="D9D9D9"/>
-              <w:right w:val="single" w:sz="4" w:color="D9D9D9"/>
-            </w:tcBorders>
-            <w:tcMar>
-              <w:top w:w="105" w:type="dxa"/>
-              <w:bottom w:w="105" w:type="dxa"/>
-              <w:left w:w="125" w:type="dxa"/>
-              <w:right w:w="125" w:type="dxa"/>
-            </w:tcMar>
-          </w:tcPr>
-          <w:p>
-            <w:r>
-              <w:t>checkApplicationDetails() в сервисе; FOREIGN KEY.</w:t>
-            </w:r>
-          </w:p>
-        </w:tc>
-      </w:tr>
-      <w:tr>
-        <w:tc>
-          <w:tcPr>
-            <w:tcW w:type="dxa" w:w="5102"/>
-            <w:vAlign w:val="center"/>
-            <w:tcBorders>
-              <w:top w:val="single" w:sz="4" w:color="D9D9D9"/>
-              <w:left w:val="single" w:sz="4" w:color="D9D9D9"/>
-              <w:bottom w:val="single" w:sz="4" w:color="D9D9D9"/>
-              <w:right w:val="single" w:sz="4" w:color="D9D9D9"/>
-            </w:tcBorders>
-            <w:tcMar>
-              <w:top w:w="105" w:type="dxa"/>
-              <w:bottom w:w="105" w:type="dxa"/>
-              <w:left w:w="125" w:type="dxa"/>
-              <w:right w:w="125" w:type="dxa"/>
-            </w:tcMar>
-          </w:tcPr>
-          <w:p>
-            <w:pPr>
-              <w:spacing w:after="0" w:line="269" w:lineRule="auto"/>
-            </w:pPr>
-            <w:r>
-              <w:rPr>
-                <w:rFonts w:ascii="Arial" w:hAnsi="Arial"/>
-                <w:color w:val="141C28"/>
-                <w:sz w:val="18"/>
-              </w:rPr>
-              <w:t>Название экзамена 2–120 символов.</w:t>
-            </w:r>
-          </w:p>
-        </w:tc>
-        <w:tc>
-          <w:tcPr>
-            <w:tcW w:type="dxa" w:w="4309"/>
-            <w:vAlign w:val="center"/>
-            <w:tcBorders>
-              <w:top w:val="single" w:sz="4" w:color="D9D9D9"/>
-              <w:left w:val="single" w:sz="4" w:color="D9D9D9"/>
-              <w:bottom w:val="single" w:sz="4" w:color="D9D9D9"/>
-              <w:right w:val="single" w:sz="4" w:color="D9D9D9"/>
-            </w:tcBorders>
-            <w:tcMar>
-              <w:top w:w="105" w:type="dxa"/>
-              <w:bottom w:w="105" w:type="dxa"/>
-              <w:left w:w="125" w:type="dxa"/>
-              <w:right w:w="125" w:type="dxa"/>
-            </w:tcMar>
-          </w:tcPr>
-          <w:p>
-            <w:r>
-              <w:t>checkApplicationDetails() в сервисе; CHECK в БД.</w:t>
-            </w:r>
-          </w:p>
-        </w:tc>
-      </w:tr>
-      <w:tr>
-        <w:tc>
-          <w:tcPr>
-            <w:tcW w:type="dxa" w:w="5102"/>
-            <w:shd w:fill="F4F7FA"/>
-            <w:vAlign w:val="center"/>
-            <w:tcBorders>
-              <w:top w:val="single" w:sz="4" w:color="D9D9D9"/>
-              <w:left w:val="single" w:sz="4" w:color="D9D9D9"/>
-              <w:bottom w:val="single" w:sz="4" w:color="D9D9D9"/>
-              <w:right w:val="single" w:sz="4" w:color="D9D9D9"/>
-            </w:tcBorders>
-            <w:tcMar>
-              <w:top w:w="105" w:type="dxa"/>
-              <w:bottom w:w="105" w:type="dxa"/>
-              <w:left w:w="125" w:type="dxa"/>
-              <w:right w:w="125" w:type="dxa"/>
-            </w:tcMar>
-          </w:tcPr>
-          <w:p>
-            <w:pPr>
-              <w:spacing w:after="0" w:line="269" w:lineRule="auto"/>
-            </w:pPr>
-            <w:r>
-              <w:rPr>
-                <w:rFonts w:ascii="Arial" w:hAnsi="Arial"/>
-                <w:color w:val="141C28"/>
-                <w:sz w:val="18"/>
-              </w:rPr>
-              <w:t>Новая или измененная заявка назначается на будущее время.</w:t>
-            </w:r>
-          </w:p>
-        </w:tc>
-        <w:tc>
-          <w:tcPr>
-            <w:tcW w:type="dxa" w:w="4309"/>
-            <w:shd w:fill="F4F7FA"/>
-            <w:vAlign w:val="center"/>
-            <w:tcBorders>
-              <w:top w:val="single" w:sz="4" w:color="D9D9D9"/>
-              <w:left w:val="single" w:sz="4" w:color="D9D9D9"/>
-              <w:bottom w:val="single" w:sz="4" w:color="D9D9D9"/>
-              <w:right w:val="single" w:sz="4" w:color="D9D9D9"/>
-            </w:tcBorders>
-            <w:tcMar>
-              <w:top w:w="105" w:type="dxa"/>
-              <w:bottom w:w="105" w:type="dxa"/>
-              <w:left w:w="125" w:type="dxa"/>
-              <w:right w:w="125" w:type="dxa"/>
-            </w:tcMar>
-          </w:tcPr>
-          <w:p>
-            <w:r>
-              <w:t>checkApplicationDetails() в сервисе.</w:t>
-            </w:r>
-          </w:p>
-        </w:tc>
-      </w:tr>
-      <w:tr>
-        <w:tc>
-          <w:tcPr>
-            <w:tcW w:type="dxa" w:w="5102"/>
-            <w:vAlign w:val="center"/>
-            <w:tcBorders>
-              <w:top w:val="single" w:sz="4" w:color="D9D9D9"/>
-              <w:left w:val="single" w:sz="4" w:color="D9D9D9"/>
-              <w:bottom w:val="single" w:sz="4" w:color="D9D9D9"/>
-              <w:right w:val="single" w:sz="4" w:color="D9D9D9"/>
-            </w:tcBorders>
-            <w:tcMar>
-              <w:top w:w="105" w:type="dxa"/>
-              <w:bottom w:w="105" w:type="dxa"/>
-              <w:left w:w="125" w:type="dxa"/>
-              <w:right w:w="125" w:type="dxa"/>
-            </w:tcMar>
-          </w:tcPr>
-          <w:p>
-            <w:pPr>
-              <w:spacing w:after="0" w:line="269" w:lineRule="auto"/>
-            </w:pPr>
-            <w:r>
-              <w:rPr>
-                <w:rFonts w:ascii="Arial" w:hAnsi="Arial"/>
-                <w:color w:val="141C28"/>
-                <w:sz w:val="18"/>
-              </w:rPr>
-              <w:t>Нет двух активных заявок на один экзамен в одно время.</w:t>
-            </w:r>
-          </w:p>
-        </w:tc>
-        <w:tc>
-          <w:tcPr>
-            <w:tcW w:type="dxa" w:w="4309"/>
-            <w:vAlign w:val="center"/>
-            <w:tcBorders>
-              <w:top w:val="single" w:sz="4" w:color="D9D9D9"/>
-              <w:left w:val="single" w:sz="4" w:color="D9D9D9"/>
-              <w:bottom w:val="single" w:sz="4" w:color="D9D9D9"/>
-              <w:right w:val="single" w:sz="4" w:color="D9D9D9"/>
-            </w:tcBorders>
-            <w:tcMar>
-              <w:top w:w="105" w:type="dxa"/>
-              <w:bottom w:w="105" w:type="dxa"/>
-              <w:left w:w="125" w:type="dxa"/>
-              <w:right w:w="125" w:type="dxa"/>
-            </w:tcMar>
-          </w:tcPr>
-          <w:p>
-            <w:r>
-              <w:t>hasActiveDuplicate() в репозитории; UNIQUE INDEX.</w:t>
-            </w:r>
-          </w:p>
-        </w:tc>
-      </w:tr>
-      <w:tr>
-        <w:tc>
-          <w:tcPr>
-            <w:tcW w:type="dxa" w:w="5102"/>
-            <w:shd w:fill="F4F7FA"/>
-            <w:vAlign w:val="center"/>
-            <w:tcBorders>
-              <w:top w:val="single" w:sz="4" w:color="D9D9D9"/>
-              <w:left w:val="single" w:sz="4" w:color="D9D9D9"/>
-              <w:bottom w:val="single" w:sz="4" w:color="D9D9D9"/>
-              <w:right w:val="single" w:sz="4" w:color="D9D9D9"/>
-            </w:tcBorders>
-            <w:tcMar>
-              <w:top w:w="105" w:type="dxa"/>
-              <w:bottom w:w="105" w:type="dxa"/>
-              <w:left w:w="125" w:type="dxa"/>
-              <w:right w:w="125" w:type="dxa"/>
-            </w:tcMar>
-          </w:tcPr>
-          <w:p>
-            <w:pPr>
-              <w:spacing w:after="0" w:line="269" w:lineRule="auto"/>
-            </w:pPr>
-            <w:r>
-              <w:rPr>
-                <w:rFonts w:ascii="Arial" w:hAnsi="Arial"/>
-                <w:color w:val="141C28"/>
-                <w:sz w:val="18"/>
-              </w:rPr>
-              <w:t>Разрешены только NEW → APPROVED/CANCELLED и APPROVED → COMPLETED/CANCELLED.</w:t>
-            </w:r>
-          </w:p>
-        </w:tc>
-        <w:tc>
-          <w:tcPr>
-            <w:tcW w:type="dxa" w:w="4309"/>
-            <w:shd w:fill="F4F7FA"/>
-            <w:vAlign w:val="center"/>
-            <w:tcBorders>
-              <w:top w:val="single" w:sz="4" w:color="D9D9D9"/>
-              <w:left w:val="single" w:sz="4" w:color="D9D9D9"/>
-              <w:bottom w:val="single" w:sz="4" w:color="D9D9D9"/>
-              <w:right w:val="single" w:sz="4" w:color="D9D9D9"/>
-            </w:tcBorders>
-            <w:tcMar>
-              <w:top w:w="105" w:type="dxa"/>
-              <w:bottom w:w="105" w:type="dxa"/>
-              <w:left w:w="125" w:type="dxa"/>
-              <w:right w:w="125" w:type="dxa"/>
-            </w:tcMar>
-          </w:tcPr>
-          <w:p>
-            <w:r>
-              <w:t>changeStatus() в сервисе.</w:t>
-            </w:r>
-          </w:p>
-        </w:tc>
-      </w:tr>
-      <w:tr>
-        <w:tc>
-          <w:tcPr>
-            <w:tcW w:type="dxa" w:w="5102"/>
-            <w:vAlign w:val="center"/>
-            <w:tcBorders>
-              <w:top w:val="single" w:sz="4" w:color="D9D9D9"/>
-              <w:left w:val="single" w:sz="4" w:color="D9D9D9"/>
-              <w:bottom w:val="single" w:sz="4" w:color="D9D9D9"/>
-              <w:right w:val="single" w:sz="4" w:color="D9D9D9"/>
-            </w:tcBorders>
-            <w:tcMar>
-              <w:top w:w="105" w:type="dxa"/>
-              <w:bottom w:w="105" w:type="dxa"/>
-              <w:left w:w="125" w:type="dxa"/>
-              <w:right w:w="125" w:type="dxa"/>
-            </w:tcMar>
-          </w:tcPr>
-          <w:p>
-            <w:pPr>
-              <w:spacing w:after="0" w:line="269" w:lineRule="auto"/>
-            </w:pPr>
-            <w:r>
-              <w:rPr>
-                <w:rFonts w:ascii="Arial" w:hAnsi="Arial"/>
-                <w:color w:val="141C28"/>
-                <w:sz w:val="18"/>
-              </w:rPr>
-              <w:t>Завершение после времени экзамена, балл 0–100; для других статусов балл отсутствует.</w:t>
-            </w:r>
-          </w:p>
-        </w:tc>
-        <w:tc>
-          <w:tcPr>
-            <w:tcW w:type="dxa" w:w="4309"/>
-            <w:vAlign w:val="center"/>
-            <w:tcBorders>
-              <w:top w:val="single" w:sz="4" w:color="D9D9D9"/>
-              <w:left w:val="single" w:sz="4" w:color="D9D9D9"/>
-              <w:bottom w:val="single" w:sz="4" w:color="D9D9D9"/>
-              <w:right w:val="single" w:sz="4" w:color="D9D9D9"/>
-            </w:tcBorders>
-            <w:tcMar>
-              <w:top w:w="105" w:type="dxa"/>
-              <w:bottom w:w="105" w:type="dxa"/>
-              <w:left w:w="125" w:type="dxa"/>
-              <w:right w:w="125" w:type="dxa"/>
-            </w:tcMar>
-          </w:tcPr>
-          <w:p>
-            <w:r>
-              <w:t>changeStatus() в сервисе; CHECK valid_exam_score.</w:t>
-            </w:r>
-          </w:p>
-        </w:tc>
-      </w:tr>
-    </w:tbl>
-    <w:p>
-      <w:pPr>
-        <w:spacing w:after="0"/>
-      </w:pPr>
-    </w:p>
-    <w:p>
-      <w:pPr>
-        <w:pStyle w:val="Heading1"/>
-        <w:pageBreakBefore w:val="0"/>
-      </w:pPr>
-      <w:r>
-        <w:t>12 Создание изменение и удаление записей</w:t>
-      </w:r>
-    </w:p>
-    <w:p>
-      <w:pPr>
-        <w:keepNext w:val="0"/>
-      </w:pPr>
-      <w:r>
-        <w:t>CRUD для основной сущности показан в меню «Заявки на экзамен». Создание: пункт 1 читает ID кандидата, экзамен и дату; сервис проверяет данные, репозиторий выполняет INSERT и возвращает ID.</w:t>
-      </w:r>
-    </w:p>
-    <w:p>
-      <w:pPr>
-        <w:keepNext w:val="0"/>
-      </w:pPr>
-      <w:r>
-        <w:t>Изменение: пункт 4 показывает текущую заявку, позволяет оставить отдельные поля прежними и вызывает updateApplication(); завершенную и отмененную заявку изменять нельзя. Удаление: пункт 5 вызывает deleteApplication(), после проверки ID репозиторий выполняет DELETE.</w:t>
-      </w:r>
-    </w:p>
-    <w:p>
-      <w:pPr>
-        <w:pStyle w:val="Source"/>
-      </w:pPr>
-      <w:r>
-        <w:t>Пример: вызовы сервиса из ui/ConsoleUi.java</w:t>
-      </w:r>
-    </w:p>
-    <w:p>
-      <w:pPr>
-        <w:pStyle w:val="Code"/>
-        <w:keepLines/>
-      </w:pPr>
-      <w:r>
-        <w:t>service.createApplication(applicantId, exam, date);</w:t>
-        <w:br/>
-        <w:t>service.updateApplication(id, applicantId, exam, date);</w:t>
-        <w:br/>
-        <w:t>service.deleteApplication(id);</w:t>
-      </w:r>
-    </w:p>
-    <w:p>
-      <w:pPr>
-        <w:pStyle w:val="Heading1"/>
-        <w:pageBreakBefore w:val="0"/>
-      </w:pPr>
-      <w:r>
-        <w:t>13 Поиск фильтрация и сортировка</w:t>
-      </w:r>
-    </w:p>
-    <w:p>
-      <w:pPr>
-        <w:keepNext/>
-      </w:pPr>
-      <w:r>
-        <w:t>Сервис сначала читает заявки из PostgreSQL, затем использует Stream API. Поэтому пользователь видит результаты из БД, а операции над небольшим учебным набором выполняются в Java.</w:t>
-      </w:r>
-    </w:p>
-    <w:tbl>
-      <w:tblPr>
-        <w:tblW w:type="auto" w:w="0"/>
-        <w:jc w:val="center"/>
-        <w:tblLayout w:type="fixed"/>
-        <w:tblLook w:firstColumn="1" w:firstRow="1" w:lastColumn="0" w:lastRow="0" w:noHBand="0" w:noVBand="1" w:val="04A0"/>
-      </w:tblPr>
-      <w:tblGrid>
-        <w:gridCol w:w="1757"/>
-        <w:gridCol w:w="7654"/>
-      </w:tblGrid>
-      <w:tr>
-        <w:trPr>
-          <w:tblHeader w:val="true"/>
-        </w:trPr>
-        <w:tc>
-          <w:tcPr>
-            <w:tcW w:type="dxa" w:w="1757"/>
-            <w:shd w:fill="263A5A"/>
-            <w:vAlign w:val="center"/>
-            <w:tcBorders>
-              <w:top w:val="single" w:sz="4" w:color="D9D9D9"/>
-              <w:left w:val="single" w:sz="4" w:color="D9D9D9"/>
-              <w:bottom w:val="single" w:sz="4" w:color="D9D9D9"/>
-              <w:right w:val="single" w:sz="4" w:color="D9D9D9"/>
-            </w:tcBorders>
-            <w:tcMar>
-              <w:top w:w="105" w:type="dxa"/>
-              <w:bottom w:w="105" w:type="dxa"/>
-              <w:left w:w="125" w:type="dxa"/>
-              <w:right w:w="125" w:type="dxa"/>
-            </w:tcMar>
-          </w:tcPr>
-          <w:p>
-            <w:pPr>
-              <w:spacing w:after="0" w:line="269" w:lineRule="auto"/>
-            </w:pPr>
-            <w:r>
-              <w:rPr>
-                <w:rFonts w:ascii="Arial" w:hAnsi="Arial"/>
-                <w:b/>
-                <w:color w:val="FFFFFF"/>
-                <w:sz w:val="18"/>
-              </w:rPr>
-              <w:t>Операция</w:t>
-            </w:r>
-          </w:p>
-        </w:tc>
-        <w:tc>
-          <w:tcPr>
-            <w:tcW w:type="dxa" w:w="7654"/>
-            <w:shd w:fill="263A5A"/>
-            <w:vAlign w:val="center"/>
-            <w:tcBorders>
-              <w:top w:val="single" w:sz="4" w:color="D9D9D9"/>
-              <w:left w:val="single" w:sz="4" w:color="D9D9D9"/>
-              <w:bottom w:val="single" w:sz="4" w:color="D9D9D9"/>
-              <w:right w:val="single" w:sz="4" w:color="D9D9D9"/>
-            </w:tcBorders>
-            <w:tcMar>
-              <w:top w:w="105" w:type="dxa"/>
-              <w:bottom w:w="105" w:type="dxa"/>
-              <w:left w:w="125" w:type="dxa"/>
-              <w:right w:w="125" w:type="dxa"/>
-            </w:tcMar>
-          </w:tcPr>
-          <w:p>
-            <w:pPr>
-              <w:spacing w:after="0" w:line="269" w:lineRule="auto"/>
-            </w:pPr>
-            <w:r>
-              <w:rPr>
-                <w:rFonts w:ascii="Arial" w:hAnsi="Arial"/>
-                <w:b/>
-                <w:color w:val="FFFFFF"/>
-                <w:sz w:val="18"/>
-              </w:rPr>
-              <w:t>Два варианта и особенности</w:t>
-            </w:r>
-          </w:p>
-        </w:tc>
-      </w:tr>
-      <w:tr>
-        <w:tc>
-          <w:tcPr>
-            <w:tcW w:type="dxa" w:w="1757"/>
-            <w:vAlign w:val="center"/>
-            <w:tcBorders>
-              <w:top w:val="single" w:sz="4" w:color="D9D9D9"/>
-              <w:left w:val="single" w:sz="4" w:color="D9D9D9"/>
-              <w:bottom w:val="single" w:sz="4" w:color="D9D9D9"/>
-              <w:right w:val="single" w:sz="4" w:color="D9D9D9"/>
-            </w:tcBorders>
-            <w:tcMar>
-              <w:top w:w="105" w:type="dxa"/>
-              <w:bottom w:w="105" w:type="dxa"/>
-              <w:left w:w="125" w:type="dxa"/>
-              <w:right w:w="125" w:type="dxa"/>
-            </w:tcMar>
-          </w:tcPr>
-          <w:p>
-            <w:pPr>
-              <w:spacing w:after="0" w:line="269" w:lineRule="auto"/>
-            </w:pPr>
-            <w:r>
-              <w:rPr>
-                <w:rFonts w:ascii="Arial" w:hAnsi="Arial"/>
-                <w:color w:val="141C28"/>
-                <w:sz w:val="18"/>
-              </w:rPr>
-              <w:t>Поиск</w:t>
-            </w:r>
-          </w:p>
-        </w:tc>
-        <w:tc>
-          <w:tcPr>
-            <w:tcW w:type="dxa" w:w="7654"/>
-            <w:vAlign w:val="center"/>
-            <w:tcBorders>
-              <w:top w:val="single" w:sz="4" w:color="D9D9D9"/>
-              <w:left w:val="single" w:sz="4" w:color="D9D9D9"/>
-              <w:bottom w:val="single" w:sz="4" w:color="D9D9D9"/>
-              <w:right w:val="single" w:sz="4" w:color="D9D9D9"/>
-            </w:tcBorders>
-            <w:tcMar>
-              <w:top w:w="105" w:type="dxa"/>
-              <w:bottom w:w="105" w:type="dxa"/>
-              <w:left w:w="125" w:type="dxa"/>
-              <w:right w:w="125" w:type="dxa"/>
-            </w:tcMar>
-          </w:tcPr>
-          <w:p>
-            <w:pPr>
-              <w:spacing w:after="0" w:line="269" w:lineRule="auto"/>
-            </w:pPr>
-            <w:r>
-              <w:rPr>
-                <w:rFonts w:ascii="Arial" w:hAnsi="Arial"/>
-                <w:color w:val="141C28"/>
-                <w:sz w:val="18"/>
-              </w:rPr>
-              <w:t>По фрагменту названия экзамена; по фрагменту ФИО кандидата. Регистр не учитывается.</w:t>
-            </w:r>
-          </w:p>
-        </w:tc>
-      </w:tr>
-      <w:tr>
-        <w:tc>
-          <w:tcPr>
-            <w:tcW w:type="dxa" w:w="1757"/>
-            <w:shd w:fill="F4F7FA"/>
-            <w:vAlign w:val="center"/>
-            <w:tcBorders>
-              <w:top w:val="single" w:sz="4" w:color="D9D9D9"/>
-              <w:left w:val="single" w:sz="4" w:color="D9D9D9"/>
-              <w:bottom w:val="single" w:sz="4" w:color="D9D9D9"/>
-              <w:right w:val="single" w:sz="4" w:color="D9D9D9"/>
-            </w:tcBorders>
-            <w:tcMar>
-              <w:top w:w="105" w:type="dxa"/>
-              <w:bottom w:w="105" w:type="dxa"/>
-              <w:left w:w="125" w:type="dxa"/>
-              <w:right w:w="125" w:type="dxa"/>
-            </w:tcMar>
-          </w:tcPr>
-          <w:p>
-            <w:pPr>
-              <w:spacing w:after="0" w:line="269" w:lineRule="auto"/>
-            </w:pPr>
-            <w:r>
-              <w:rPr>
-                <w:rFonts w:ascii="Arial" w:hAnsi="Arial"/>
-                <w:color w:val="141C28"/>
+                <w:b w:val="0"/>
+                <w:color w:val="000000"/>
                 <w:sz w:val="18"/>
               </w:rPr>
               <w:t>Фильтрация</w:t>
@@ -1714,9 +575,9 @@
         </w:tc>
         <w:tc>
           <w:tcPr>
-            <w:tcW w:type="dxa" w:w="7654"/>
-            <w:shd w:fill="F4F7FA"/>
+            <w:tcW w:type="dxa" w:w="6941"/>
             <w:vAlign w:val="center"/>
+            <w:shd w:fill="FFFFFF"/>
             <w:tcBorders>
               <w:top w:val="single" w:sz="4" w:color="D9D9D9"/>
               <w:left w:val="single" w:sz="4" w:color="D9D9D9"/>
@@ -1724,32 +585,37 @@
               <w:right w:val="single" w:sz="4" w:color="D9D9D9"/>
             </w:tcBorders>
             <w:tcMar>
-              <w:top w:w="105" w:type="dxa"/>
-              <w:bottom w:w="105" w:type="dxa"/>
-              <w:left w:w="125" w:type="dxa"/>
-              <w:right w:w="125" w:type="dxa"/>
+              <w:top w:w="55" w:type="dxa"/>
+              <w:bottom w:w="55" w:type="dxa"/>
+              <w:left w:w="100" w:type="dxa"/>
+              <w:right w:w="100" w:type="dxa"/>
             </w:tcMar>
           </w:tcPr>
           <w:p>
             <w:pPr>
-              <w:spacing w:after="0" w:line="269" w:lineRule="auto"/>
+              <w:spacing w:after="0" w:line="254" w:lineRule="auto"/>
             </w:pPr>
             <w:r>
               <w:rPr>
                 <w:rFonts w:ascii="Arial" w:hAnsi="Arial"/>
-                <w:color w:val="141C28"/>
+                <w:b w:val="0"/>
+                <w:color w:val="000000"/>
                 <w:sz w:val="18"/>
               </w:rPr>
-              <w:t>По enum-статусу; по включительному диапазону дат экзамена.</w:t>
+              <w:t>Кандидаты: статус, домен; заявки: статус, даты; экзаменаторы: статус, предмет.</w:t>
             </w:r>
           </w:p>
         </w:tc>
       </w:tr>
       <w:tr>
+        <w:trPr>
+          <w:cantSplit/>
+        </w:trPr>
         <w:tc>
           <w:tcPr>
-            <w:tcW w:type="dxa" w:w="1757"/>
+            <w:tcW w:type="dxa" w:w="2952"/>
             <w:vAlign w:val="center"/>
+            <w:shd w:fill="F2F5F9"/>
             <w:tcBorders>
               <w:top w:val="single" w:sz="4" w:color="D9D9D9"/>
               <w:left w:val="single" w:sz="4" w:color="D9D9D9"/>
@@ -1757,30 +623,32 @@
               <w:right w:val="single" w:sz="4" w:color="D9D9D9"/>
             </w:tcBorders>
             <w:tcMar>
-              <w:top w:w="105" w:type="dxa"/>
-              <w:bottom w:w="105" w:type="dxa"/>
-              <w:left w:w="125" w:type="dxa"/>
-              <w:right w:w="125" w:type="dxa"/>
+              <w:top w:w="55" w:type="dxa"/>
+              <w:bottom w:w="55" w:type="dxa"/>
+              <w:left w:w="100" w:type="dxa"/>
+              <w:right w:w="100" w:type="dxa"/>
             </w:tcMar>
           </w:tcPr>
           <w:p>
             <w:pPr>
-              <w:spacing w:after="0" w:line="269" w:lineRule="auto"/>
+              <w:spacing w:after="0" w:line="254" w:lineRule="auto"/>
             </w:pPr>
             <w:r>
               <w:rPr>
                 <w:rFonts w:ascii="Arial" w:hAnsi="Arial"/>
-                <w:color w:val="141C28"/>
+                <w:b w:val="0"/>
+                <w:color w:val="000000"/>
                 <w:sz w:val="18"/>
               </w:rPr>
-              <w:t>Сортировка</w:t>
+              <w:t>Экспорт</w:t>
             </w:r>
           </w:p>
         </w:tc>
         <w:tc>
           <w:tcPr>
-            <w:tcW w:type="dxa" w:w="7654"/>
+            <w:tcW w:type="dxa" w:w="6941"/>
             <w:vAlign w:val="center"/>
+            <w:shd w:fill="F2F5F9"/>
             <w:tcBorders>
               <w:top w:val="single" w:sz="4" w:color="D9D9D9"/>
               <w:left w:val="single" w:sz="4" w:color="D9D9D9"/>
@@ -1788,23 +656,95 @@
               <w:right w:val="single" w:sz="4" w:color="D9D9D9"/>
             </w:tcBorders>
             <w:tcMar>
-              <w:top w:w="105" w:type="dxa"/>
-              <w:bottom w:w="105" w:type="dxa"/>
-              <w:left w:w="125" w:type="dxa"/>
-              <w:right w:w="125" w:type="dxa"/>
+              <w:top w:w="55" w:type="dxa"/>
+              <w:bottom w:w="55" w:type="dxa"/>
+              <w:left w:w="100" w:type="dxa"/>
+              <w:right w:w="100" w:type="dxa"/>
             </w:tcMar>
           </w:tcPr>
           <w:p>
             <w:pPr>
-              <w:spacing w:after="0" w:line="269" w:lineRule="auto"/>
+              <w:spacing w:after="0" w:line="254" w:lineRule="auto"/>
             </w:pPr>
             <w:r>
               <w:rPr>
                 <w:rFonts w:ascii="Arial" w:hAnsi="Arial"/>
-                <w:color w:val="141C28"/>
+                <w:b w:val="0"/>
+                <w:color w:val="000000"/>
                 <w:sz w:val="18"/>
               </w:rPr>
-              <w:t>По дате экзамена по возрастанию; по ФИО кандидата по алфавиту без учета регистра.</w:t>
+              <w:t>Пункт 5 главного меню; укажите outputs/exam-center/from_database.xlsx. Файл будет содержать три листа.</w:t>
+            </w:r>
+          </w:p>
+        </w:tc>
+      </w:tr>
+      <w:tr>
+        <w:trPr>
+          <w:cantSplit/>
+        </w:trPr>
+        <w:tc>
+          <w:tcPr>
+            <w:tcW w:type="dxa" w:w="2952"/>
+            <w:vAlign w:val="center"/>
+            <w:shd w:fill="FFFFFF"/>
+            <w:tcBorders>
+              <w:top w:val="single" w:sz="4" w:color="D9D9D9"/>
+              <w:left w:val="single" w:sz="4" w:color="D9D9D9"/>
+              <w:bottom w:val="single" w:sz="4" w:color="D9D9D9"/>
+              <w:right w:val="single" w:sz="4" w:color="D9D9D9"/>
+            </w:tcBorders>
+            <w:tcMar>
+              <w:top w:w="55" w:type="dxa"/>
+              <w:bottom w:w="55" w:type="dxa"/>
+              <w:left w:w="100" w:type="dxa"/>
+              <w:right w:w="100" w:type="dxa"/>
+            </w:tcMar>
+          </w:tcPr>
+          <w:p>
+            <w:pPr>
+              <w:spacing w:after="0" w:line="254" w:lineRule="auto"/>
+            </w:pPr>
+            <w:r>
+              <w:rPr>
+                <w:rFonts w:ascii="Arial" w:hAnsi="Arial"/>
+                <w:b w:val="0"/>
+                <w:color w:val="000000"/>
+                <w:sz w:val="18"/>
+              </w:rPr>
+              <w:t>Консольный интерфейс</w:t>
+            </w:r>
+          </w:p>
+        </w:tc>
+        <w:tc>
+          <w:tcPr>
+            <w:tcW w:type="dxa" w:w="6941"/>
+            <w:vAlign w:val="center"/>
+            <w:shd w:fill="FFFFFF"/>
+            <w:tcBorders>
+              <w:top w:val="single" w:sz="4" w:color="D9D9D9"/>
+              <w:left w:val="single" w:sz="4" w:color="D9D9D9"/>
+              <w:bottom w:val="single" w:sz="4" w:color="D9D9D9"/>
+              <w:right w:val="single" w:sz="4" w:color="D9D9D9"/>
+            </w:tcBorders>
+            <w:tcMar>
+              <w:top w:w="55" w:type="dxa"/>
+              <w:bottom w:w="55" w:type="dxa"/>
+              <w:left w:w="100" w:type="dxa"/>
+              <w:right w:w="100" w:type="dxa"/>
+            </w:tcMar>
+          </w:tcPr>
+          <w:p>
+            <w:pPr>
+              <w:spacing w:after="0" w:line="254" w:lineRule="auto"/>
+            </w:pPr>
+            <w:r>
+              <w:rPr>
+                <w:rFonts w:ascii="Arial" w:hAnsi="Arial"/>
+                <w:b w:val="0"/>
+                <w:color w:val="000000"/>
+                <w:sz w:val="18"/>
+              </w:rPr>
+              <w:t>Пункты 1–3 главного меню содержат CRUD, поиск, фильтры и сортировку своей сущности.</w:t>
             </w:r>
           </w:p>
         </w:tc>
@@ -1812,76 +752,312 @@
     </w:tbl>
     <w:p>
       <w:pPr>
-        <w:spacing w:after="0"/>
-      </w:pPr>
-    </w:p>
-    <w:p>
-      <w:pPr>
-        <w:pStyle w:val="Source"/>
+        <w:pStyle w:val="Heading1"/>
       </w:pPr>
       <w:r>
-        <w:t>Пример: service/ExamCenterService.java, фильтр по статусу</w:t>
+        <w:t>Сценарий участника 1 Кандидаты</w:t>
       </w:r>
     </w:p>
     <w:p>
       <w:pPr>
-        <w:pStyle w:val="Code"/>
-        <w:keepLines/>
+        <w:ind w:left="288" w:hanging="288"/>
       </w:pPr>
       <w:r>
-        <w:t>return allApplications().stream()</w:t>
-        <w:br/>
-        <w:t xml:space="preserve">    .filter(x -&gt; x.getStatus() == status)</w:t>
-        <w:br/>
-        <w:t xml:space="preserve">    .collect(Collectors.toList());</w:t>
+        <w:rPr>
+          <w:b/>
+        </w:rPr>
+        <w:t xml:space="preserve">1. </w:t>
+      </w:r>
+      <w:r>
+        <w:t>Открыть пункт 1, вывести список. Показать Applicant.java, ApplicantStatus.java, ApplicantService.java и ApplicantRepository.java.</w:t>
       </w:r>
     </w:p>
     <w:p>
       <w:pPr>
-        <w:keepNext w:val="0"/>
+        <w:ind w:left="288" w:hanging="288"/>
       </w:pPr>
       <w:r>
-        <w:t>В меню это пункты 3, 4 и 5. Для равных ключей сортировка использует ID как дополнительный критерий.</w:t>
+        <w:rPr>
+          <w:b/>
+        </w:rPr>
+        <w:t xml:space="preserve">2. </w:t>
+      </w:r>
+      <w:r>
+        <w:t>Создать кандидата с уникальным email и статусом ACTIVE; записать выданный ID. Получить запись по ID и изменить телефон или статус.</w:t>
+      </w:r>
+    </w:p>
+    <w:p>
+      <w:pPr>
+        <w:ind w:left="288" w:hanging="288"/>
+      </w:pPr>
+      <w:r>
+        <w:rPr>
+          <w:b/>
+        </w:rPr>
+        <w:t xml:space="preserve">3. </w:t>
+      </w:r>
+      <w:r>
+        <w:t>Найти по ФИО, отфильтровать по статусу и домену email. Отсортировать по ФИО прямо и обратно; при необходимости показать сортировку по email.</w:t>
+      </w:r>
+    </w:p>
+    <w:p>
+      <w:pPr>
+        <w:ind w:left="288" w:hanging="288"/>
+      </w:pPr>
+      <w:r>
+        <w:rPr>
+          <w:b/>
+        </w:rPr>
+        <w:t xml:space="preserve">4. </w:t>
+      </w:r>
+      <w:r>
+        <w:t>Показать ошибку на несуществующем ID или повторном email. Удалить созданного кандидата, пока у него нет заявок.</w:t>
       </w:r>
     </w:p>
     <w:p>
       <w:pPr>
         <w:pStyle w:val="Heading1"/>
-        <w:pageBreakBefore w:val="0"/>
       </w:pPr>
       <w:r>
-        <w:t>14 Экспорт данных</w:t>
+        <w:t>Сценарий участника 2 Заявки</w:t>
       </w:r>
     </w:p>
     <w:p>
       <w:pPr>
-        <w:keepNext w:val="0"/>
+        <w:ind w:left="288" w:hanging="288"/>
       </w:pPr>
       <w:r>
-        <w:t>Пункт 7 меню вызывает DataExporter.export(). ConsoleUi передает актуальные данные PostgreSQL, а XlsxExporter через Apache POI создает .xlsx с листами «Кандидаты» и «Заявки». ID и баллы записываются как числа, даты — как даты Excel.</w:t>
+        <w:rPr>
+          <w:b/>
+        </w:rPr>
+        <w:t xml:space="preserve">1. </w:t>
+      </w:r>
+      <w:r>
+        <w:t>Открыть пункт 2, вывести список. Показать ExamApplication.java, ApplicationStatus.java, ExamApplicationService.java и ExamApplicationRepository.java.</w:t>
       </w:r>
     </w:p>
     <w:p>
       <w:pPr>
-        <w:pStyle w:val="Source"/>
+        <w:ind w:left="288" w:hanging="288"/>
       </w:pPr>
       <w:r>
-        <w:t>Пример: ui/ConsoleUi.java</w:t>
+        <w:rPr>
+          <w:b/>
+        </w:rPr>
+        <w:t xml:space="preserve">2. </w:t>
+      </w:r>
+      <w:r>
+        <w:t>Взять ID существующего активного кандидата. Создать заявку на будущую дату, получить по ID и изменить название или дату.</w:t>
       </w:r>
     </w:p>
     <w:p>
       <w:pPr>
-        <w:pStyle w:val="Code"/>
-        <w:keepLines/>
+        <w:ind w:left="288" w:hanging="288"/>
       </w:pPr>
       <w:r>
-        <w:t>exporter.export(path, service.allApplicants(), service.allApplications());</w:t>
+        <w:rPr>
+          <w:b/>
+        </w:rPr>
+        <w:t xml:space="preserve">3. </w:t>
+      </w:r>
+      <w:r>
+        <w:t>Найти по экзамену и ФИО кандидата; отфильтровать по статусу и диапазону дат; отсортировать по дате прямо и обратно.</w:t>
+      </w:r>
+    </w:p>
+    <w:p>
+      <w:pPr>
+        <w:ind w:left="288" w:hanging="288"/>
+      </w:pPr>
+      <w:r>
+        <w:rPr>
+          <w:b/>
+        </w:rPr>
+        <w:t xml:space="preserve">4. </w:t>
+      </w:r>
+      <w:r>
+        <w:t>Согласовать заявку, затем отменить или удалить тестовую запись. Показать ошибку на прошедшей дате, дубликате или запрещённом переходе статуса.</w:t>
+      </w:r>
+    </w:p>
+    <w:p>
+      <w:pPr>
+        <w:pStyle w:val="Heading1"/>
+      </w:pPr>
+      <w:r>
+        <w:t>Сценарий участника 3 Экзаменаторы</w:t>
+      </w:r>
+    </w:p>
+    <w:p>
+      <w:pPr>
+        <w:ind w:left="288" w:hanging="288"/>
+      </w:pPr>
+      <w:r>
+        <w:rPr>
+          <w:b/>
+        </w:rPr>
+        <w:t xml:space="preserve">1. </w:t>
+      </w:r>
+      <w:r>
+        <w:t>Открыть пункт 3, вывести список. Показать Examiner.java, ExaminerStatus.java, ExaminerService.java и ExaminerRepository.java.</w:t>
+      </w:r>
+    </w:p>
+    <w:p>
+      <w:pPr>
+        <w:ind w:left="288" w:hanging="288"/>
+      </w:pPr>
+      <w:r>
+        <w:rPr>
+          <w:b/>
+        </w:rPr>
+        <w:t xml:space="preserve">2. </w:t>
+      </w:r>
+      <w:r>
+        <w:t>Создать экзаменатора с уникальным email, получить по ID, изменить предмет или статус.</w:t>
+      </w:r>
+    </w:p>
+    <w:p>
+      <w:pPr>
+        <w:ind w:left="288" w:hanging="288"/>
+      </w:pPr>
+      <w:r>
+        <w:rPr>
+          <w:b/>
+        </w:rPr>
+        <w:t xml:space="preserve">3. </w:t>
+      </w:r>
+      <w:r>
+        <w:t>Найти по ФИО, отфильтровать по статусу и предмету. Отсортировать по предмету прямо и обратно; при необходимости — по ФИО.</w:t>
+      </w:r>
+    </w:p>
+    <w:p>
+      <w:pPr>
+        <w:ind w:left="288" w:hanging="288"/>
+      </w:pPr>
+      <w:r>
+        <w:rPr>
+          <w:b/>
+        </w:rPr>
+        <w:t xml:space="preserve">4. </w:t>
+      </w:r>
+      <w:r>
+        <w:t>Показать ошибку на повторном email или неизвестном ID. Удалить созданного экзаменатора.</w:t>
+      </w:r>
+    </w:p>
+    <w:p>
+      <w:pPr>
+        <w:pStyle w:val="Heading1"/>
+      </w:pPr>
+      <w:r>
+        <w:t>Короткие ответы на типовые вопросы</w:t>
+      </w:r>
+    </w:p>
+    <w:p>
+      <w:pPr>
+        <w:pStyle w:val="Heading2"/>
+      </w:pPr>
+      <w:r>
+        <w:t>Почему это многослойная архитектура</w:t>
+      </w:r>
+    </w:p>
+    <w:p>
+      <w:r>
+        <w:t>ConsoleUi отвечает только за взаимодействие с человеком; сервисы — за правила; репозитории — за SQL. Поэтому правила остаются в Java, а не прячутся в меню или базе.</w:t>
+      </w:r>
+    </w:p>
+    <w:p>
+      <w:pPr>
+        <w:pStyle w:val="Heading2"/>
+      </w:pPr>
+      <w:r>
+        <w:t>Что такое инкапсуляция и полиморфизм здесь</w:t>
+      </w:r>
+    </w:p>
+    <w:p>
+      <w:r>
+        <w:t>Поля моделей private; доступ к ним идёт через геттеры и сеттеры. Переменная exporter имеет тип интерфейса DataExporter, а реальный объект — XlsxExporter. Вызов export выполняет реализацию этого объекта.</w:t>
+      </w:r>
+    </w:p>
+    <w:p>
+      <w:pPr>
+        <w:pStyle w:val="Heading2"/>
+      </w:pPr>
+      <w:r>
+        <w:t>Зачем enum и исключения</w:t>
+      </w:r>
+    </w:p>
+    <w:p>
+      <w:r>
+        <w:t>Enum ограничивает статусы: нельзя произвольно записать неизвестный статус. Каждый сервис создаёт своё исключение при нарушении правила или отсутствии ID; меню перехватывает его и продолжает работу.</w:t>
+      </w:r>
+    </w:p>
+    <w:p>
+      <w:pPr>
+        <w:pStyle w:val="Heading2"/>
+      </w:pPr>
+      <w:r>
+        <w:t>Как работают коллекции, фильтры и сортировки</w:t>
+      </w:r>
+    </w:p>
+    <w:p>
+      <w:r>
+        <w:t>Репозиторий возвращает List объектов. Сервис применяет Stream API, filter и Comparator. Параметр ascending выбирает прямой порядок или reversed() для обратного.</w:t>
+      </w:r>
+    </w:p>
+    <w:p>
+      <w:pPr>
+        <w:pStyle w:val="Heading2"/>
+      </w:pPr>
+      <w:r>
+        <w:t>Что делает JDBC и чем PreparedStatement отличается от Statement</w:t>
+      </w:r>
+    </w:p>
+    <w:p>
+      <w:r>
+        <w:t>JDBC соединяет Java с PostgreSQL. PreparedStatement хранит SQL с параметрами ?, значения передаются методами setString, setLong и другими. Обычный Statement выполняет готовую SQL-строку; в этом проекте используется только его константа RETURN_GENERATED_KEYS для получения нового ID. try-with-resources закрывает соединение и результаты.</w:t>
+      </w:r>
+    </w:p>
+    <w:p>
+      <w:pPr>
+        <w:pStyle w:val="Heading2"/>
+      </w:pPr>
+      <w:r>
+        <w:t>Как связаны таблицы и какие правила защищают данные</w:t>
+      </w:r>
+    </w:p>
+    <w:p>
+      <w:r>
+        <w:t>exam_applications.applicant_id — внешний ключ на applicants.id. Один кандидат может иметь много заявок; несуществующий кандидат недопустим. PRIMARY KEY, UNIQUE, NOT NULL и CHECK проверяются PostgreSQL. Сервис дополнительно проверяет существование и статус кандидата, дату, дубликаты, переходы статуса и балл.</w:t>
+      </w:r>
+    </w:p>
+    <w:p>
+      <w:pPr>
+        <w:pStyle w:val="Heading2"/>
+      </w:pPr>
+      <w:r>
+        <w:t>Как работает экспорт</w:t>
+      </w:r>
+    </w:p>
+    <w:p>
+      <w:r>
+        <w:t>Меню запрашивает свежие списки из сервисов и передаёт их XlsxExporter через DataExporter. Apache POI создаёт книгу с листами «Кандидаты», «Заявки» и «Экзаменаторы». Для демонстрации выберите пункт 5 и откройте готовый .xlsx.</w:t>
+      </w:r>
+    </w:p>
+    <w:p>
+      <w:pPr>
+        <w:pStyle w:val="Heading1"/>
+      </w:pPr>
+      <w:r>
+        <w:t>Перед входом в аудиторию</w:t>
+      </w:r>
+    </w:p>
+    <w:p>
+      <w:r>
+        <w:t>Запустите ./run.sh, убедитесь, что меню открывается. В папке проекта должны быть pom.xml, sql/schema.sql, docs/er-diagram.svg и outputs/exam-center/from_database.xlsx. Для быстрой проверки работы можно запустить IntegrationSmoke; успешный итог — THREE ENTITY INTEGRATION PASSED.</w:t>
       </w:r>
     </w:p>
     <w:sectPr>
-      <w:footerReference w:type="default" r:id="rId10"/>
-      <w:pgSz w:w="11906" w:h="16838"/>
-      <w:pgMar w:top="1134" w:right="1219" w:bottom="1077" w:left="1276" w:header="720" w:footer="720" w:gutter="0"/>
+      <w:footerReference w:type="default" r:id="rId9"/>
+      <w:pgSz w:w="12240" w:h="15840"/>
+      <w:pgMar w:top="893" w:right="1152" w:bottom="835" w:left="1152" w:header="720" w:footer="720" w:gutter="0"/>
       <w:cols w:space="720"/>
       <w:docGrid w:linePitch="360"/>
     </w:sectPr>
@@ -1899,10 +1075,10 @@
     <w:r>
       <w:rPr>
         <w:rFonts w:ascii="Arial" w:hAnsi="Arial"/>
-        <w:color w:val="5A5F69"/>
+        <w:color w:val="5A6473"/>
         <w:sz w:val="16"/>
       </w:rPr>
-      <w:t xml:space="preserve">Экзаменационный центр  ·  КР 1  ·  </w:t>
+      <w:t xml:space="preserve">Экзаменационный центр  ·  </w:t>
     </w:r>
     <w:fldSimple w:instr="PAGE"/>
   </w:p>
@@ -2273,13 +1449,13 @@
     <w:qFormat/>
     <w:rsid w:val="00FC693F"/>
     <w:pPr>
-      <w:keepLines/>
-      <w:spacing w:after="120" w:line="281" w:lineRule="auto"/>
+      <w:spacing w:line="259" w:lineRule="auto" w:after="80"/>
     </w:pPr>
     <w:rPr>
-      <w:rFonts w:ascii="Arial" w:hAnsi="Arial"/>
+      <w:rFonts w:ascii="Arial" w:hAnsi="Arial" w:eastAsia="Arial" w:cs="Arial"/>
+      <w:b w:val="0"/>
       <w:color w:val="000000"/>
-      <w:sz w:val="21"/>
+      <w:sz w:val="20"/>
     </w:rPr>
   </w:style>
   <w:style w:type="paragraph" w:styleId="Header">
@@ -2337,15 +1513,15 @@
     <w:pPr>
       <w:keepNext/>
       <w:keepLines/>
-      <w:spacing w:before="300" w:after="120"/>
+      <w:spacing w:before="180" w:after="80"/>
       <w:outlineLvl w:val="0"/>
     </w:pPr>
     <w:rPr>
-      <w:rFonts w:asciiTheme="majorHAnsi" w:eastAsiaTheme="majorEastAsia" w:hAnsiTheme="majorHAnsi" w:cstheme="majorBidi" w:ascii="Arial" w:hAnsi="Arial"/>
+      <w:rFonts w:asciiTheme="majorHAnsi" w:eastAsiaTheme="majorEastAsia" w:hAnsiTheme="majorHAnsi" w:cstheme="majorBidi" w:ascii="Arial" w:hAnsi="Arial" w:eastAsia="Arial" w:cs="Arial"/>
       <w:b/>
       <w:bCs/>
       <w:color w:val="000000"/>
-      <w:sz w:val="25"/>
+      <w:sz w:val="27"/>
       <w:szCs w:val="28"/>
     </w:rPr>
   </w:style>
@@ -2361,11 +1537,11 @@
     <w:pPr>
       <w:keepNext/>
       <w:keepLines/>
-      <w:spacing w:before="200" w:after="80"/>
+      <w:spacing w:before="120" w:after="80"/>
       <w:outlineLvl w:val="1"/>
     </w:pPr>
     <w:rPr>
-      <w:rFonts w:asciiTheme="majorHAnsi" w:eastAsiaTheme="majorEastAsia" w:hAnsiTheme="majorHAnsi" w:cstheme="majorBidi" w:ascii="Arial" w:hAnsi="Arial"/>
+      <w:rFonts w:asciiTheme="majorHAnsi" w:eastAsiaTheme="majorEastAsia" w:hAnsiTheme="majorHAnsi" w:cstheme="majorBidi" w:ascii="Arial" w:hAnsi="Arial" w:eastAsia="Arial" w:cs="Arial"/>
       <w:b/>
       <w:bCs/>
       <w:color w:val="000000"/>
@@ -2623,16 +1799,19 @@
     <w:qFormat/>
     <w:rsid w:val="00FC693F"/>
     <w:pPr>
-      <w:spacing w:after="140" w:line="240" w:lineRule="auto"/>
+      <w:spacing w:after="200" w:line="240" w:lineRule="auto"/>
       <w:contextualSpacing/>
+      <w:pBdr>
+        <w:bottom w:val="nil"/>
+      </w:pBdr>
     </w:pPr>
     <w:rPr>
-      <w:rFonts w:asciiTheme="majorHAnsi" w:eastAsiaTheme="majorEastAsia" w:hAnsiTheme="majorHAnsi" w:cstheme="majorBidi" w:ascii="Arial" w:hAnsi="Arial"/>
+      <w:rFonts w:asciiTheme="majorHAnsi" w:eastAsiaTheme="majorEastAsia" w:hAnsiTheme="majorHAnsi" w:cstheme="majorBidi" w:ascii="Arial" w:hAnsi="Arial" w:eastAsia="Arial" w:cs="Arial"/>
       <w:b/>
       <w:color w:val="000000"/>
       <w:spacing w:val="5"/>
       <w:kern w:val="28"/>
-      <w:sz w:val="36"/>
+      <w:sz w:val="40"/>
       <w:szCs w:val="52"/>
     </w:rPr>
   </w:style>
@@ -13961,31 +13140,6 @@
         <w:shd w:val="clear" w:color="auto" w:fill="FBCAA2" w:themeFill="accent6" w:themeFillTint="7F"/>
       </w:tcPr>
     </w:tblStylePr>
-  </w:style>
-  <w:style w:type="paragraph" w:customStyle="1" w:styleId="Code">
-    <w:name w:val="Code"/>
-    <w:pPr>
-      <w:spacing w:before="60" w:after="160" w:line="240" w:lineRule="auto"/>
-      <w:ind w:left="198"/>
-    </w:pPr>
-    <w:rPr>
-      <w:rFonts w:ascii="Courier New" w:hAnsi="Courier New"/>
-      <w:color w:val="192332"/>
-      <w:sz w:val="17"/>
-    </w:rPr>
-  </w:style>
-  <w:style w:type="paragraph" w:customStyle="1" w:styleId="Source">
-    <w:name w:val="Source"/>
-    <w:pPr>
-      <w:keepNext/>
-      <w:spacing w:after="40"/>
-    </w:pPr>
-    <w:rPr>
-      <w:rFonts w:ascii="Arial" w:hAnsi="Arial"/>
-      <w:i/>
-      <w:color w:val="464E5A"/>
-      <w:sz w:val="17"/>
-    </w:rPr>
   </w:style>
 </w:styles>
 </file>

</xml_diff>

<commit_message>
Clarify defense guide for setters and sorting
</commit_message>
<xml_diff>
--- a/Ответы к защите Экзаменационный центр.docx
+++ b/Ответы к защите Экзаменационный центр.docx
@@ -12,12 +12,12 @@
     </w:p>
     <w:p>
       <w:r>
-        <w:t>Проверка требований преподавателя и сценарий показа для трёх участников</w:t>
+        <w:t>Простое объяснение требований и действий в программе для команды из трёх человек</w:t>
       </w:r>
     </w:p>
     <w:p>
       <w:r>
-        <w:t>Проект соответствует объявленной комплектности: три сущности для команды из трёх человек, полный набор операций по каждой сущности, PostgreSQL, Excel, ООП и настроенный pom.xml. На защите каждому участнику нужно открыть свой раздел меню и показать цепочку «модель → сервис → репозиторий → таблица».</w:t>
+        <w:t>Проект готов к показу: у кандидата, заявки и экзаменатора есть модель, enum, репозиторий PostgreSQL, сервис с CRUD, собственное исключение, фильтры, сортировки в обе стороны и консольное меню. Один файл Excel содержит отдельный лист для каждой сущности.</w:t>
       </w:r>
     </w:p>
     <w:p>
@@ -25,7 +25,66 @@
         <w:pStyle w:val="Heading1"/>
       </w:pPr>
       <w:r>
-        <w:t>Что показать по каждому пункту</w:t>
+        <w:t>Главная схема которую нужно запомнить</w:t>
+      </w:r>
+    </w:p>
+    <w:p>
+      <w:r>
+        <w:t>Консольное меню принимает команду → сервис проверяет данные и правила → репозиторий выполняет SQL → PostgreSQL сохраняет результат. Модель переносит данные между этими частями. При ошибке сервис выдаёт понятное исключение, а меню показывает его текст и остаётся открытым.</w:t>
+      </w:r>
+    </w:p>
+    <w:p>
+      <w:pPr>
+        <w:pStyle w:val="Heading1"/>
+      </w:pPr>
+      <w:r>
+        <w:t>Вопрос про final и сеттеры в ExamApplication</w:t>
+      </w:r>
+    </w:p>
+    <w:p>
+      <w:r>
+        <w:rPr>
+          <w:b/>
+        </w:rPr>
+        <w:t xml:space="preserve">Что сказать преподавателю. </w:t>
+      </w:r>
+      <w:r>
+        <w:t>В строке public final class ExamApplication слово final относится к классу: от него нельзя наследоваться. Поля внутри класса не final. Поэтому для каждого поля есть геттер и сеттер, в том числе для даты scheduledAt, названия examName, статуса status и ID кандидата applicantId.</w:t>
+      </w:r>
+    </w:p>
+    <w:p>
+      <w:r>
+        <w:rPr>
+          <w:b/>
+        </w:rPr>
+        <w:t xml:space="preserve">Пример. </w:t>
+      </w:r>
+      <w:r>
+        <w:t>getScheduledAt() возвращает дату из Java-объекта, а setScheduledAt(newDate) меняет её в памяти. Чтобы дата изменилась в PostgreSQL, меню вызывает ExamApplicationService.updateApplication(), сервис проверяет правила и вызывает UPDATE в ExamApplicationRepository. Сеттер сам по себе SQL не выполняет.</w:t>
+      </w:r>
+    </w:p>
+    <w:p>
+      <w:r>
+        <w:rPr>
+          <w:b/>
+        </w:rPr>
+        <w:t xml:space="preserve">Где показать. </w:t>
+      </w:r>
+      <w:r>
+        <w:t>Откройте model/ExamApplication.java: сначала private-поля и конструктор, затем пары get... и set.... Для изменения записи в базе откройте service/ExamApplicationService.java и repository/ExamApplicationRepository.java.</w:t>
+      </w:r>
+    </w:p>
+    <w:p>
+      <w:pPr>
+        <w:pStyle w:val="Heading1"/>
+      </w:pPr>
+      <w:r>
+        <w:t>Две сортировки заявок и оба направления</w:t>
+      </w:r>
+    </w:p>
+    <w:p>
+      <w:r>
+        <w:t>Сортировка по дате и сортировка по ФИО кандидата реализованы отдельно. У каждой есть прямой и обратный порядок. В коде один параметр ascending выбирает направление: true — прямое, false — обратное; для обратного используется Comparator.reversed().</w:t>
       </w:r>
     </w:p>
     <w:tbl>
@@ -35,8 +94,9 @@
         <w:tblLook w:firstColumn="1" w:firstRow="1" w:lastColumn="0" w:lastRow="0" w:noHBand="0" w:noVBand="1" w:val="04A0"/>
       </w:tblPr>
       <w:tblGrid>
-        <w:gridCol w:w="2952"/>
-        <w:gridCol w:w="6941"/>
+        <w:gridCol w:w="1944"/>
+        <w:gridCol w:w="3283"/>
+        <w:gridCol w:w="4766"/>
       </w:tblGrid>
       <w:tr>
         <w:trPr>
@@ -45,25 +105,302 @@
         </w:trPr>
         <w:tc>
           <w:tcPr>
-            <w:tcW w:type="dxa" w:w="2952"/>
+            <w:tcW w:type="dxa" w:w="1944"/>
             <w:vAlign w:val="center"/>
             <w:shd w:fill="263A5A"/>
-            <w:tcBorders>
-              <w:top w:val="single" w:sz="4" w:color="D9D9D9"/>
-              <w:left w:val="single" w:sz="4" w:color="D9D9D9"/>
-              <w:bottom w:val="single" w:sz="4" w:color="D9D9D9"/>
-              <w:right w:val="single" w:sz="4" w:color="D9D9D9"/>
-            </w:tcBorders>
             <w:tcMar>
-              <w:top w:w="55" w:type="dxa"/>
-              <w:bottom w:w="55" w:type="dxa"/>
+              <w:top w:w="65" w:type="dxa"/>
+              <w:bottom w:w="65" w:type="dxa"/>
               <w:left w:w="100" w:type="dxa"/>
               <w:right w:w="100" w:type="dxa"/>
             </w:tcMar>
           </w:tcPr>
           <w:p>
             <w:pPr>
-              <w:spacing w:after="0" w:line="254" w:lineRule="auto"/>
+              <w:spacing w:after="0" w:line="252" w:lineRule="auto"/>
+            </w:pPr>
+            <w:r>
+              <w:rPr>
+                <w:rFonts w:ascii="Arial" w:hAnsi="Arial"/>
+                <w:b/>
+                <w:color w:val="FFFFFF"/>
+                <w:sz w:val="18"/>
+              </w:rPr>
+              <w:t>Что сортируем</w:t>
+            </w:r>
+          </w:p>
+        </w:tc>
+        <w:tc>
+          <w:tcPr>
+            <w:tcW w:type="dxa" w:w="3283"/>
+            <w:vAlign w:val="center"/>
+            <w:shd w:fill="263A5A"/>
+            <w:tcMar>
+              <w:top w:w="65" w:type="dxa"/>
+              <w:bottom w:w="65" w:type="dxa"/>
+              <w:left w:w="100" w:type="dxa"/>
+              <w:right w:w="100" w:type="dxa"/>
+            </w:tcMar>
+          </w:tcPr>
+          <w:p>
+            <w:pPr>
+              <w:spacing w:after="0" w:line="252" w:lineRule="auto"/>
+            </w:pPr>
+            <w:r>
+              <w:rPr>
+                <w:rFonts w:ascii="Arial" w:hAnsi="Arial"/>
+                <w:b/>
+                <w:color w:val="FFFFFF"/>
+                <w:sz w:val="18"/>
+              </w:rPr>
+              <w:t>Метод сервиса</w:t>
+            </w:r>
+          </w:p>
+        </w:tc>
+        <w:tc>
+          <w:tcPr>
+            <w:tcW w:type="dxa" w:w="4766"/>
+            <w:vAlign w:val="center"/>
+            <w:shd w:fill="263A5A"/>
+            <w:tcMar>
+              <w:top w:w="65" w:type="dxa"/>
+              <w:bottom w:w="65" w:type="dxa"/>
+              <w:left w:w="100" w:type="dxa"/>
+              <w:right w:w="100" w:type="dxa"/>
+            </w:tcMar>
+          </w:tcPr>
+          <w:p>
+            <w:pPr>
+              <w:spacing w:after="0" w:line="252" w:lineRule="auto"/>
+            </w:pPr>
+            <w:r>
+              <w:rPr>
+                <w:rFonts w:ascii="Arial" w:hAnsi="Arial"/>
+                <w:b/>
+                <w:color w:val="FFFFFF"/>
+                <w:sz w:val="18"/>
+              </w:rPr>
+              <w:t>Как показать в меню</w:t>
+            </w:r>
+          </w:p>
+        </w:tc>
+      </w:tr>
+      <w:tr>
+        <w:trPr>
+          <w:cantSplit/>
+        </w:trPr>
+        <w:tc>
+          <w:tcPr>
+            <w:tcW w:type="dxa" w:w="1944"/>
+            <w:vAlign w:val="center"/>
+            <w:shd w:fill="FFFFFF"/>
+            <w:tcMar>
+              <w:top w:w="65" w:type="dxa"/>
+              <w:bottom w:w="65" w:type="dxa"/>
+              <w:left w:w="100" w:type="dxa"/>
+              <w:right w:w="100" w:type="dxa"/>
+            </w:tcMar>
+          </w:tcPr>
+          <w:p>
+            <w:pPr>
+              <w:spacing w:after="0" w:line="252" w:lineRule="auto"/>
+            </w:pPr>
+            <w:r>
+              <w:rPr>
+                <w:rFonts w:ascii="Arial" w:hAnsi="Arial"/>
+                <w:b w:val="0"/>
+                <w:color w:val="000000"/>
+                <w:sz w:val="18"/>
+              </w:rPr>
+              <w:t>Дата экзамена</w:t>
+            </w:r>
+          </w:p>
+        </w:tc>
+        <w:tc>
+          <w:tcPr>
+            <w:tcW w:type="dxa" w:w="3283"/>
+            <w:vAlign w:val="center"/>
+            <w:shd w:fill="FFFFFF"/>
+            <w:tcMar>
+              <w:top w:w="65" w:type="dxa"/>
+              <w:bottom w:w="65" w:type="dxa"/>
+              <w:left w:w="100" w:type="dxa"/>
+              <w:right w:w="100" w:type="dxa"/>
+            </w:tcMar>
+          </w:tcPr>
+          <w:p>
+            <w:pPr>
+              <w:spacing w:after="0" w:line="252" w:lineRule="auto"/>
+            </w:pPr>
+            <w:r>
+              <w:rPr>
+                <w:rFonts w:ascii="Arial" w:hAnsi="Arial"/>
+                <w:b w:val="0"/>
+                <w:color w:val="000000"/>
+                <w:sz w:val="18"/>
+              </w:rPr>
+              <w:t>sortByDate(true / false)</w:t>
+            </w:r>
+          </w:p>
+        </w:tc>
+        <w:tc>
+          <w:tcPr>
+            <w:tcW w:type="dxa" w:w="4766"/>
+            <w:vAlign w:val="center"/>
+            <w:shd w:fill="FFFFFF"/>
+            <w:tcMar>
+              <w:top w:w="65" w:type="dxa"/>
+              <w:bottom w:w="65" w:type="dxa"/>
+              <w:left w:w="100" w:type="dxa"/>
+              <w:right w:w="100" w:type="dxa"/>
+            </w:tcMar>
+          </w:tcPr>
+          <w:p>
+            <w:pPr>
+              <w:spacing w:after="0" w:line="252" w:lineRule="auto"/>
+            </w:pPr>
+            <w:r>
+              <w:rPr>
+                <w:rFonts w:ascii="Arial" w:hAnsi="Arial"/>
+                <w:b w:val="0"/>
+                <w:color w:val="000000"/>
+                <w:sz w:val="18"/>
+              </w:rPr>
+              <w:t>Главное меню 2 → заявки 13 → порядок 1 или 2</w:t>
+            </w:r>
+          </w:p>
+        </w:tc>
+      </w:tr>
+      <w:tr>
+        <w:trPr>
+          <w:cantSplit/>
+        </w:trPr>
+        <w:tc>
+          <w:tcPr>
+            <w:tcW w:type="dxa" w:w="1944"/>
+            <w:vAlign w:val="center"/>
+            <w:shd w:fill="F2F5F9"/>
+            <w:tcMar>
+              <w:top w:w="65" w:type="dxa"/>
+              <w:bottom w:w="65" w:type="dxa"/>
+              <w:left w:w="100" w:type="dxa"/>
+              <w:right w:w="100" w:type="dxa"/>
+            </w:tcMar>
+          </w:tcPr>
+          <w:p>
+            <w:pPr>
+              <w:spacing w:after="0" w:line="252" w:lineRule="auto"/>
+            </w:pPr>
+            <w:r>
+              <w:rPr>
+                <w:rFonts w:ascii="Arial" w:hAnsi="Arial"/>
+                <w:b w:val="0"/>
+                <w:color w:val="000000"/>
+                <w:sz w:val="18"/>
+              </w:rPr>
+              <w:t>ФИО кандидата</w:t>
+            </w:r>
+          </w:p>
+        </w:tc>
+        <w:tc>
+          <w:tcPr>
+            <w:tcW w:type="dxa" w:w="3283"/>
+            <w:vAlign w:val="center"/>
+            <w:shd w:fill="F2F5F9"/>
+            <w:tcMar>
+              <w:top w:w="65" w:type="dxa"/>
+              <w:bottom w:w="65" w:type="dxa"/>
+              <w:left w:w="100" w:type="dxa"/>
+              <w:right w:w="100" w:type="dxa"/>
+            </w:tcMar>
+          </w:tcPr>
+          <w:p>
+            <w:pPr>
+              <w:spacing w:after="0" w:line="252" w:lineRule="auto"/>
+            </w:pPr>
+            <w:r>
+              <w:rPr>
+                <w:rFonts w:ascii="Arial" w:hAnsi="Arial"/>
+                <w:b w:val="0"/>
+                <w:color w:val="000000"/>
+                <w:sz w:val="18"/>
+              </w:rPr>
+              <w:t>sortByApplicant(true / false)</w:t>
+            </w:r>
+          </w:p>
+        </w:tc>
+        <w:tc>
+          <w:tcPr>
+            <w:tcW w:type="dxa" w:w="4766"/>
+            <w:vAlign w:val="center"/>
+            <w:shd w:fill="F2F5F9"/>
+            <w:tcMar>
+              <w:top w:w="65" w:type="dxa"/>
+              <w:bottom w:w="65" w:type="dxa"/>
+              <w:left w:w="100" w:type="dxa"/>
+              <w:right w:w="100" w:type="dxa"/>
+            </w:tcMar>
+          </w:tcPr>
+          <w:p>
+            <w:pPr>
+              <w:spacing w:after="0" w:line="252" w:lineRule="auto"/>
+            </w:pPr>
+            <w:r>
+              <w:rPr>
+                <w:rFonts w:ascii="Arial" w:hAnsi="Arial"/>
+                <w:b w:val="0"/>
+                <w:color w:val="000000"/>
+                <w:sz w:val="18"/>
+              </w:rPr>
+              <w:t>Главное меню 2 → заявки 14 → порядок 1 или 2</w:t>
+            </w:r>
+          </w:p>
+        </w:tc>
+      </w:tr>
+    </w:tbl>
+    <w:p>
+      <w:r>
+        <w:t>Пример: даты 10, 12 и 15 октября идут прямо как 10 → 12 → 15, обратно как 15 → 12 → 10. ФИО «Анна, Борис, Светлана» идут прямо по алфавиту и обратно от «Светлана» к «Анна». Для заявок ФИО означает имя кандидата, который подал заявку.</w:t>
+      </w:r>
+    </w:p>
+    <w:p>
+      <w:pPr>
+        <w:pStyle w:val="Heading1"/>
+      </w:pPr>
+      <w:r>
+        <w:t>Что означает каждый пункт требований</w:t>
+      </w:r>
+    </w:p>
+    <w:tbl>
+      <w:tblPr>
+        <w:tblW w:type="auto" w:w="0"/>
+        <w:tblLayout w:type="fixed"/>
+        <w:tblLook w:firstColumn="1" w:firstRow="1" w:lastColumn="0" w:lastRow="0" w:noHBand="0" w:noVBand="1" w:val="04A0"/>
+      </w:tblPr>
+      <w:tblGrid>
+        <w:gridCol w:w="2232"/>
+        <w:gridCol w:w="7762"/>
+      </w:tblGrid>
+      <w:tr>
+        <w:trPr>
+          <w:cantSplit/>
+          <w:tblHeader w:val="true"/>
+        </w:trPr>
+        <w:tc>
+          <w:tcPr>
+            <w:tcW w:type="dxa" w:w="2232"/>
+            <w:vAlign w:val="center"/>
+            <w:shd w:fill="263A5A"/>
+            <w:tcMar>
+              <w:top w:w="65" w:type="dxa"/>
+              <w:bottom w:w="65" w:type="dxa"/>
+              <w:left w:w="100" w:type="dxa"/>
+              <w:right w:w="100" w:type="dxa"/>
+            </w:tcMar>
+          </w:tcPr>
+          <w:p>
+            <w:pPr>
+              <w:spacing w:after="0" w:line="252" w:lineRule="auto"/>
             </w:pPr>
             <w:r>
               <w:rPr>
@@ -78,25 +415,19 @@
         </w:tc>
         <w:tc>
           <w:tcPr>
-            <w:tcW w:type="dxa" w:w="6941"/>
+            <w:tcW w:type="dxa" w:w="7762"/>
             <w:vAlign w:val="center"/>
             <w:shd w:fill="263A5A"/>
-            <w:tcBorders>
-              <w:top w:val="single" w:sz="4" w:color="D9D9D9"/>
-              <w:left w:val="single" w:sz="4" w:color="D9D9D9"/>
-              <w:bottom w:val="single" w:sz="4" w:color="D9D9D9"/>
-              <w:right w:val="single" w:sz="4" w:color="D9D9D9"/>
-            </w:tcBorders>
             <w:tcMar>
-              <w:top w:w="55" w:type="dxa"/>
-              <w:bottom w:w="55" w:type="dxa"/>
+              <w:top w:w="65" w:type="dxa"/>
+              <w:bottom w:w="65" w:type="dxa"/>
               <w:left w:w="100" w:type="dxa"/>
               <w:right w:w="100" w:type="dxa"/>
             </w:tcMar>
           </w:tcPr>
           <w:p>
             <w:pPr>
-              <w:spacing w:after="0" w:line="254" w:lineRule="auto"/>
+              <w:spacing w:after="0" w:line="252" w:lineRule="auto"/>
             </w:pPr>
             <w:r>
               <w:rPr>
@@ -105,7 +436,7 @@
                 <w:color w:val="FFFFFF"/>
                 <w:sz w:val="18"/>
               </w:rPr>
-              <w:t>Где показать</w:t>
+              <w:t>Короткий ответ и место в проекте</w:t>
             </w:r>
           </w:p>
         </w:tc>
@@ -116,25 +447,19 @@
         </w:trPr>
         <w:tc>
           <w:tcPr>
-            <w:tcW w:type="dxa" w:w="2952"/>
+            <w:tcW w:type="dxa" w:w="2232"/>
             <w:vAlign w:val="center"/>
             <w:shd w:fill="FFFFFF"/>
-            <w:tcBorders>
-              <w:top w:val="single" w:sz="4" w:color="D9D9D9"/>
-              <w:left w:val="single" w:sz="4" w:color="D9D9D9"/>
-              <w:bottom w:val="single" w:sz="4" w:color="D9D9D9"/>
-              <w:right w:val="single" w:sz="4" w:color="D9D9D9"/>
-            </w:tcBorders>
             <w:tcMar>
-              <w:top w:w="55" w:type="dxa"/>
-              <w:bottom w:w="55" w:type="dxa"/>
+              <w:top w:w="65" w:type="dxa"/>
+              <w:bottom w:w="65" w:type="dxa"/>
               <w:left w:w="100" w:type="dxa"/>
               <w:right w:w="100" w:type="dxa"/>
             </w:tcMar>
           </w:tcPr>
           <w:p>
             <w:pPr>
-              <w:spacing w:after="0" w:line="254" w:lineRule="auto"/>
+              <w:spacing w:after="0" w:line="252" w:lineRule="auto"/>
             </w:pPr>
             <w:r>
               <w:rPr>
@@ -149,25 +474,19 @@
         </w:tc>
         <w:tc>
           <w:tcPr>
-            <w:tcW w:type="dxa" w:w="6941"/>
+            <w:tcW w:type="dxa" w:w="7762"/>
             <w:vAlign w:val="center"/>
             <w:shd w:fill="FFFFFF"/>
-            <w:tcBorders>
-              <w:top w:val="single" w:sz="4" w:color="D9D9D9"/>
-              <w:left w:val="single" w:sz="4" w:color="D9D9D9"/>
-              <w:bottom w:val="single" w:sz="4" w:color="D9D9D9"/>
-              <w:right w:val="single" w:sz="4" w:color="D9D9D9"/>
-            </w:tcBorders>
             <w:tcMar>
-              <w:top w:w="55" w:type="dxa"/>
-              <w:bottom w:w="55" w:type="dxa"/>
+              <w:top w:w="65" w:type="dxa"/>
+              <w:bottom w:w="65" w:type="dxa"/>
               <w:left w:w="100" w:type="dxa"/>
               <w:right w:w="100" w:type="dxa"/>
             </w:tcMar>
           </w:tcPr>
           <w:p>
             <w:pPr>
-              <w:spacing w:after="0" w:line="254" w:lineRule="auto"/>
+              <w:spacing w:after="0" w:line="252" w:lineRule="auto"/>
             </w:pPr>
             <w:r>
               <w:rPr>
@@ -176,7 +495,7 @@
                 <w:color w:val="000000"/>
                 <w:sz w:val="18"/>
               </w:rPr>
-              <w:t>model/Applicant, ExamApplication или Examiner: private-поля, конструктор, геттеры и сеттеры.</w:t>
+              <w:t>Три класса в model имеют private-поля, конструктор, геттеры и сеттеры. Это инкапсуляция: объект хранит данные внутри себя.</w:t>
             </w:r>
           </w:p>
         </w:tc>
@@ -187,25 +506,19 @@
         </w:trPr>
         <w:tc>
           <w:tcPr>
-            <w:tcW w:type="dxa" w:w="2952"/>
+            <w:tcW w:type="dxa" w:w="2232"/>
             <w:vAlign w:val="center"/>
             <w:shd w:fill="F2F5F9"/>
-            <w:tcBorders>
-              <w:top w:val="single" w:sz="4" w:color="D9D9D9"/>
-              <w:left w:val="single" w:sz="4" w:color="D9D9D9"/>
-              <w:bottom w:val="single" w:sz="4" w:color="D9D9D9"/>
-              <w:right w:val="single" w:sz="4" w:color="D9D9D9"/>
-            </w:tcBorders>
             <w:tcMar>
-              <w:top w:w="55" w:type="dxa"/>
-              <w:bottom w:w="55" w:type="dxa"/>
+              <w:top w:w="65" w:type="dxa"/>
+              <w:bottom w:w="65" w:type="dxa"/>
               <w:left w:w="100" w:type="dxa"/>
               <w:right w:w="100" w:type="dxa"/>
             </w:tcMar>
           </w:tcPr>
           <w:p>
             <w:pPr>
-              <w:spacing w:after="0" w:line="254" w:lineRule="auto"/>
+              <w:spacing w:after="0" w:line="252" w:lineRule="auto"/>
             </w:pPr>
             <w:r>
               <w:rPr>
@@ -220,25 +533,19 @@
         </w:tc>
         <w:tc>
           <w:tcPr>
-            <w:tcW w:type="dxa" w:w="6941"/>
+            <w:tcW w:type="dxa" w:w="7762"/>
             <w:vAlign w:val="center"/>
             <w:shd w:fill="F2F5F9"/>
-            <w:tcBorders>
-              <w:top w:val="single" w:sz="4" w:color="D9D9D9"/>
-              <w:left w:val="single" w:sz="4" w:color="D9D9D9"/>
-              <w:bottom w:val="single" w:sz="4" w:color="D9D9D9"/>
-              <w:right w:val="single" w:sz="4" w:color="D9D9D9"/>
-            </w:tcBorders>
             <w:tcMar>
-              <w:top w:w="55" w:type="dxa"/>
-              <w:bottom w:w="55" w:type="dxa"/>
+              <w:top w:w="65" w:type="dxa"/>
+              <w:bottom w:w="65" w:type="dxa"/>
               <w:left w:w="100" w:type="dxa"/>
               <w:right w:w="100" w:type="dxa"/>
             </w:tcMar>
           </w:tcPr>
           <w:p>
             <w:pPr>
-              <w:spacing w:after="0" w:line="254" w:lineRule="auto"/>
+              <w:spacing w:after="0" w:line="252" w:lineRule="auto"/>
             </w:pPr>
             <w:r>
               <w:rPr>
@@ -247,7 +554,7 @@
                 <w:color w:val="000000"/>
                 <w:sz w:val="18"/>
               </w:rPr>
-              <w:t>repository/*Repository.java: INSERT, SELECT, UPDATE, DELETE через JDBC и PreparedStatement.</w:t>
+              <w:t>Три класса в repository выполняют SQL через JDBC и PreparedStatement. Это слой доступа к PostgreSQL.</w:t>
             </w:r>
           </w:p>
         </w:tc>
@@ -258,25 +565,19 @@
         </w:trPr>
         <w:tc>
           <w:tcPr>
-            <w:tcW w:type="dxa" w:w="2952"/>
+            <w:tcW w:type="dxa" w:w="2232"/>
             <w:vAlign w:val="center"/>
             <w:shd w:fill="FFFFFF"/>
-            <w:tcBorders>
-              <w:top w:val="single" w:sz="4" w:color="D9D9D9"/>
-              <w:left w:val="single" w:sz="4" w:color="D9D9D9"/>
-              <w:bottom w:val="single" w:sz="4" w:color="D9D9D9"/>
-              <w:right w:val="single" w:sz="4" w:color="D9D9D9"/>
-            </w:tcBorders>
             <w:tcMar>
-              <w:top w:w="55" w:type="dxa"/>
-              <w:bottom w:w="55" w:type="dxa"/>
+              <w:top w:w="65" w:type="dxa"/>
+              <w:bottom w:w="65" w:type="dxa"/>
               <w:left w:w="100" w:type="dxa"/>
               <w:right w:w="100" w:type="dxa"/>
             </w:tcMar>
           </w:tcPr>
           <w:p>
             <w:pPr>
-              <w:spacing w:after="0" w:line="254" w:lineRule="auto"/>
+              <w:spacing w:after="0" w:line="252" w:lineRule="auto"/>
             </w:pPr>
             <w:r>
               <w:rPr>
@@ -285,31 +586,25 @@
                 <w:color w:val="000000"/>
                 <w:sz w:val="18"/>
               </w:rPr>
-              <w:t>Сервис и CRUD</w:t>
+              <w:t>CRUD в сервисе</w:t>
             </w:r>
           </w:p>
         </w:tc>
         <w:tc>
           <w:tcPr>
-            <w:tcW w:type="dxa" w:w="6941"/>
+            <w:tcW w:type="dxa" w:w="7762"/>
             <w:vAlign w:val="center"/>
             <w:shd w:fill="FFFFFF"/>
-            <w:tcBorders>
-              <w:top w:val="single" w:sz="4" w:color="D9D9D9"/>
-              <w:left w:val="single" w:sz="4" w:color="D9D9D9"/>
-              <w:bottom w:val="single" w:sz="4" w:color="D9D9D9"/>
-              <w:right w:val="single" w:sz="4" w:color="D9D9D9"/>
-            </w:tcBorders>
             <w:tcMar>
-              <w:top w:w="55" w:type="dxa"/>
-              <w:bottom w:w="55" w:type="dxa"/>
+              <w:top w:w="65" w:type="dxa"/>
+              <w:bottom w:w="65" w:type="dxa"/>
               <w:left w:w="100" w:type="dxa"/>
               <w:right w:w="100" w:type="dxa"/>
             </w:tcMar>
           </w:tcPr>
           <w:p>
             <w:pPr>
-              <w:spacing w:after="0" w:line="254" w:lineRule="auto"/>
+              <w:spacing w:after="0" w:line="252" w:lineRule="auto"/>
             </w:pPr>
             <w:r>
               <w:rPr>
@@ -318,7 +613,7 @@
                 <w:color w:val="000000"/>
                 <w:sz w:val="18"/>
               </w:rPr>
-              <w:t>service/*Service.java: проверка данных и вызов репозитория для четырёх операций.</w:t>
+              <w:t>Три класса в service дают создать, получить/показать, изменить и удалить запись. Сервис также проверяет правила.</w:t>
             </w:r>
           </w:p>
         </w:tc>
@@ -329,25 +624,19 @@
         </w:trPr>
         <w:tc>
           <w:tcPr>
-            <w:tcW w:type="dxa" w:w="2952"/>
+            <w:tcW w:type="dxa" w:w="2232"/>
             <w:vAlign w:val="center"/>
             <w:shd w:fill="F2F5F9"/>
-            <w:tcBorders>
-              <w:top w:val="single" w:sz="4" w:color="D9D9D9"/>
-              <w:left w:val="single" w:sz="4" w:color="D9D9D9"/>
-              <w:bottom w:val="single" w:sz="4" w:color="D9D9D9"/>
-              <w:right w:val="single" w:sz="4" w:color="D9D9D9"/>
-            </w:tcBorders>
             <w:tcMar>
-              <w:top w:w="55" w:type="dxa"/>
-              <w:bottom w:w="55" w:type="dxa"/>
+              <w:top w:w="65" w:type="dxa"/>
+              <w:bottom w:w="65" w:type="dxa"/>
               <w:left w:w="100" w:type="dxa"/>
               <w:right w:w="100" w:type="dxa"/>
             </w:tcMar>
           </w:tcPr>
           <w:p>
             <w:pPr>
-              <w:spacing w:after="0" w:line="254" w:lineRule="auto"/>
+              <w:spacing w:after="0" w:line="252" w:lineRule="auto"/>
             </w:pPr>
             <w:r>
               <w:rPr>
@@ -362,25 +651,19 @@
         </w:tc>
         <w:tc>
           <w:tcPr>
-            <w:tcW w:type="dxa" w:w="6941"/>
+            <w:tcW w:type="dxa" w:w="7762"/>
             <w:vAlign w:val="center"/>
             <w:shd w:fill="F2F5F9"/>
-            <w:tcBorders>
-              <w:top w:val="single" w:sz="4" w:color="D9D9D9"/>
-              <w:left w:val="single" w:sz="4" w:color="D9D9D9"/>
-              <w:bottom w:val="single" w:sz="4" w:color="D9D9D9"/>
-              <w:right w:val="single" w:sz="4" w:color="D9D9D9"/>
-            </w:tcBorders>
             <w:tcMar>
-              <w:top w:w="55" w:type="dxa"/>
-              <w:bottom w:w="55" w:type="dxa"/>
+              <w:top w:w="65" w:type="dxa"/>
+              <w:bottom w:w="65" w:type="dxa"/>
               <w:left w:w="100" w:type="dxa"/>
               <w:right w:w="100" w:type="dxa"/>
             </w:tcMar>
           </w:tcPr>
           <w:p>
             <w:pPr>
-              <w:spacing w:after="0" w:line="254" w:lineRule="auto"/>
+              <w:spacing w:after="0" w:line="252" w:lineRule="auto"/>
             </w:pPr>
             <w:r>
               <w:rPr>
@@ -389,7 +672,7 @@
                 <w:color w:val="000000"/>
                 <w:sz w:val="18"/>
               </w:rPr>
-              <w:t>ApplicantStatus, ApplicationStatus, ExaminerStatus — допустимые статусы.</w:t>
+              <w:t>ApplicantStatus, ApplicationStatus и ExaminerStatus ограничивают допустимые статусы.</w:t>
             </w:r>
           </w:p>
         </w:tc>
@@ -400,25 +683,19 @@
         </w:trPr>
         <w:tc>
           <w:tcPr>
-            <w:tcW w:type="dxa" w:w="2952"/>
+            <w:tcW w:type="dxa" w:w="2232"/>
             <w:vAlign w:val="center"/>
             <w:shd w:fill="FFFFFF"/>
-            <w:tcBorders>
-              <w:top w:val="single" w:sz="4" w:color="D9D9D9"/>
-              <w:left w:val="single" w:sz="4" w:color="D9D9D9"/>
-              <w:bottom w:val="single" w:sz="4" w:color="D9D9D9"/>
-              <w:right w:val="single" w:sz="4" w:color="D9D9D9"/>
-            </w:tcBorders>
             <w:tcMar>
-              <w:top w:w="55" w:type="dxa"/>
-              <w:bottom w:w="55" w:type="dxa"/>
+              <w:top w:w="65" w:type="dxa"/>
+              <w:bottom w:w="65" w:type="dxa"/>
               <w:left w:w="100" w:type="dxa"/>
               <w:right w:w="100" w:type="dxa"/>
             </w:tcMar>
           </w:tcPr>
           <w:p>
             <w:pPr>
-              <w:spacing w:after="0" w:line="254" w:lineRule="auto"/>
+              <w:spacing w:after="0" w:line="252" w:lineRule="auto"/>
             </w:pPr>
             <w:r>
               <w:rPr>
@@ -427,31 +704,25 @@
                 <w:color w:val="000000"/>
                 <w:sz w:val="18"/>
               </w:rPr>
-              <w:t>Исключения</w:t>
+              <w:t>Исключение</w:t>
             </w:r>
           </w:p>
         </w:tc>
         <w:tc>
           <w:tcPr>
-            <w:tcW w:type="dxa" w:w="6941"/>
+            <w:tcW w:type="dxa" w:w="7762"/>
             <w:vAlign w:val="center"/>
             <w:shd w:fill="FFFFFF"/>
-            <w:tcBorders>
-              <w:top w:val="single" w:sz="4" w:color="D9D9D9"/>
-              <w:left w:val="single" w:sz="4" w:color="D9D9D9"/>
-              <w:bottom w:val="single" w:sz="4" w:color="D9D9D9"/>
-              <w:right w:val="single" w:sz="4" w:color="D9D9D9"/>
-            </w:tcBorders>
             <w:tcMar>
-              <w:top w:w="55" w:type="dxa"/>
-              <w:bottom w:w="55" w:type="dxa"/>
+              <w:top w:w="65" w:type="dxa"/>
+              <w:bottom w:w="65" w:type="dxa"/>
               <w:left w:w="100" w:type="dxa"/>
               <w:right w:w="100" w:type="dxa"/>
             </w:tcMar>
           </w:tcPr>
           <w:p>
             <w:pPr>
-              <w:spacing w:after="0" w:line="254" w:lineRule="auto"/>
+              <w:spacing w:after="0" w:line="252" w:lineRule="auto"/>
             </w:pPr>
             <w:r>
               <w:rPr>
@@ -460,7 +731,7 @@
                 <w:color w:val="000000"/>
                 <w:sz w:val="18"/>
               </w:rPr>
-              <w:t>Внутренний класс *Exception в каждом сервисе; ConsoleUi выводит сообщение и продолжает работу.</w:t>
+              <w:t>В каждом сервисе есть своё *Exception. Например, запрос неизвестного ID выдаёт сообщение, а меню продолжает работу.</w:t>
             </w:r>
           </w:p>
         </w:tc>
@@ -471,25 +742,78 @@
         </w:trPr>
         <w:tc>
           <w:tcPr>
-            <w:tcW w:type="dxa" w:w="2952"/>
+            <w:tcW w:type="dxa" w:w="2232"/>
             <w:vAlign w:val="center"/>
             <w:shd w:fill="F2F5F9"/>
-            <w:tcBorders>
-              <w:top w:val="single" w:sz="4" w:color="D9D9D9"/>
-              <w:left w:val="single" w:sz="4" w:color="D9D9D9"/>
-              <w:bottom w:val="single" w:sz="4" w:color="D9D9D9"/>
-              <w:right w:val="single" w:sz="4" w:color="D9D9D9"/>
-            </w:tcBorders>
             <w:tcMar>
-              <w:top w:w="55" w:type="dxa"/>
-              <w:bottom w:w="55" w:type="dxa"/>
+              <w:top w:w="65" w:type="dxa"/>
+              <w:bottom w:w="65" w:type="dxa"/>
               <w:left w:w="100" w:type="dxa"/>
               <w:right w:w="100" w:type="dxa"/>
             </w:tcMar>
           </w:tcPr>
           <w:p>
             <w:pPr>
-              <w:spacing w:after="0" w:line="254" w:lineRule="auto"/>
+              <w:spacing w:after="0" w:line="252" w:lineRule="auto"/>
+            </w:pPr>
+            <w:r>
+              <w:rPr>
+                <w:rFonts w:ascii="Arial" w:hAnsi="Arial"/>
+                <w:b w:val="0"/>
+                <w:color w:val="000000"/>
+                <w:sz w:val="18"/>
+              </w:rPr>
+              <w:t>Фильтрация</w:t>
+            </w:r>
+          </w:p>
+        </w:tc>
+        <w:tc>
+          <w:tcPr>
+            <w:tcW w:type="dxa" w:w="7762"/>
+            <w:vAlign w:val="center"/>
+            <w:shd w:fill="F2F5F9"/>
+            <w:tcMar>
+              <w:top w:w="65" w:type="dxa"/>
+              <w:bottom w:w="65" w:type="dxa"/>
+              <w:left w:w="100" w:type="dxa"/>
+              <w:right w:w="100" w:type="dxa"/>
+            </w:tcMar>
+          </w:tcPr>
+          <w:p>
+            <w:pPr>
+              <w:spacing w:after="0" w:line="252" w:lineRule="auto"/>
+            </w:pPr>
+            <w:r>
+              <w:rPr>
+                <w:rFonts w:ascii="Arial" w:hAnsi="Arial"/>
+                <w:b w:val="0"/>
+                <w:color w:val="000000"/>
+                <w:sz w:val="18"/>
+              </w:rPr>
+              <w:t>Сервис берёт List объектов и оставляет только подходящие записи: по статусу, дате, предмету или домену email.</w:t>
+            </w:r>
+          </w:p>
+        </w:tc>
+      </w:tr>
+      <w:tr>
+        <w:trPr>
+          <w:cantSplit/>
+        </w:trPr>
+        <w:tc>
+          <w:tcPr>
+            <w:tcW w:type="dxa" w:w="2232"/>
+            <w:vAlign w:val="center"/>
+            <w:shd w:fill="FFFFFF"/>
+            <w:tcMar>
+              <w:top w:w="65" w:type="dxa"/>
+              <w:bottom w:w="65" w:type="dxa"/>
+              <w:left w:w="100" w:type="dxa"/>
+              <w:right w:w="100" w:type="dxa"/>
+            </w:tcMar>
+          </w:tcPr>
+          <w:p>
+            <w:pPr>
+              <w:spacing w:after="0" w:line="252" w:lineRule="auto"/>
             </w:pPr>
             <w:r>
               <w:rPr>
@@ -504,25 +828,19 @@
         </w:tc>
         <w:tc>
           <w:tcPr>
-            <w:tcW w:type="dxa" w:w="6941"/>
+            <w:tcW w:type="dxa" w:w="7762"/>
             <w:vAlign w:val="center"/>
-            <w:shd w:fill="F2F5F9"/>
-            <w:tcBorders>
-              <w:top w:val="single" w:sz="4" w:color="D9D9D9"/>
-              <w:left w:val="single" w:sz="4" w:color="D9D9D9"/>
-              <w:bottom w:val="single" w:sz="4" w:color="D9D9D9"/>
-              <w:right w:val="single" w:sz="4" w:color="D9D9D9"/>
-            </w:tcBorders>
+            <w:shd w:fill="FFFFFF"/>
             <w:tcMar>
-              <w:top w:w="55" w:type="dxa"/>
-              <w:bottom w:w="55" w:type="dxa"/>
+              <w:top w:w="65" w:type="dxa"/>
+              <w:bottom w:w="65" w:type="dxa"/>
               <w:left w:w="100" w:type="dxa"/>
               <w:right w:w="100" w:type="dxa"/>
             </w:tcMar>
           </w:tcPr>
           <w:p>
             <w:pPr>
-              <w:spacing w:after="0" w:line="254" w:lineRule="auto"/>
+              <w:spacing w:after="0" w:line="252" w:lineRule="auto"/>
             </w:pPr>
             <w:r>
               <w:rPr>
@@ -531,7 +849,7 @@
                 <w:color w:val="000000"/>
                 <w:sz w:val="18"/>
               </w:rPr>
-              <w:t>Методы sortByName/Email, sortByDate/Applicant, sortByName/Subject с аргументом ascending.</w:t>
+              <w:t>Сервис берёт List и упорядочивает его через Comparator. Направление выбирает пользователь.</w:t>
             </w:r>
           </w:p>
         </w:tc>
@@ -542,96 +860,19 @@
         </w:trPr>
         <w:tc>
           <w:tcPr>
-            <w:tcW w:type="dxa" w:w="2952"/>
+            <w:tcW w:type="dxa" w:w="2232"/>
             <w:vAlign w:val="center"/>
-            <w:shd w:fill="FFFFFF"/>
-            <w:tcBorders>
-              <w:top w:val="single" w:sz="4" w:color="D9D9D9"/>
-              <w:left w:val="single" w:sz="4" w:color="D9D9D9"/>
-              <w:bottom w:val="single" w:sz="4" w:color="D9D9D9"/>
-              <w:right w:val="single" w:sz="4" w:color="D9D9D9"/>
-            </w:tcBorders>
+            <w:shd w:fill="F2F5F9"/>
             <w:tcMar>
-              <w:top w:w="55" w:type="dxa"/>
-              <w:bottom w:w="55" w:type="dxa"/>
+              <w:top w:w="65" w:type="dxa"/>
+              <w:bottom w:w="65" w:type="dxa"/>
               <w:left w:w="100" w:type="dxa"/>
               <w:right w:w="100" w:type="dxa"/>
             </w:tcMar>
           </w:tcPr>
           <w:p>
             <w:pPr>
-              <w:spacing w:after="0" w:line="254" w:lineRule="auto"/>
-            </w:pPr>
-            <w:r>
-              <w:rPr>
-                <w:rFonts w:ascii="Arial" w:hAnsi="Arial"/>
-                <w:b w:val="0"/>
-                <w:color w:val="000000"/>
-                <w:sz w:val="18"/>
-              </w:rPr>
-              <w:t>Фильтрация</w:t>
-            </w:r>
-          </w:p>
-        </w:tc>
-        <w:tc>
-          <w:tcPr>
-            <w:tcW w:type="dxa" w:w="6941"/>
-            <w:vAlign w:val="center"/>
-            <w:shd w:fill="FFFFFF"/>
-            <w:tcBorders>
-              <w:top w:val="single" w:sz="4" w:color="D9D9D9"/>
-              <w:left w:val="single" w:sz="4" w:color="D9D9D9"/>
-              <w:bottom w:val="single" w:sz="4" w:color="D9D9D9"/>
-              <w:right w:val="single" w:sz="4" w:color="D9D9D9"/>
-            </w:tcBorders>
-            <w:tcMar>
-              <w:top w:w="55" w:type="dxa"/>
-              <w:bottom w:w="55" w:type="dxa"/>
-              <w:left w:w="100" w:type="dxa"/>
-              <w:right w:w="100" w:type="dxa"/>
-            </w:tcMar>
-          </w:tcPr>
-          <w:p>
-            <w:pPr>
-              <w:spacing w:after="0" w:line="254" w:lineRule="auto"/>
-            </w:pPr>
-            <w:r>
-              <w:rPr>
-                <w:rFonts w:ascii="Arial" w:hAnsi="Arial"/>
-                <w:b w:val="0"/>
-                <w:color w:val="000000"/>
-                <w:sz w:val="18"/>
-              </w:rPr>
-              <w:t>Кандидаты: статус, домен; заявки: статус, даты; экзаменаторы: статус, предмет.</w:t>
-            </w:r>
-          </w:p>
-        </w:tc>
-      </w:tr>
-      <w:tr>
-        <w:trPr>
-          <w:cantSplit/>
-        </w:trPr>
-        <w:tc>
-          <w:tcPr>
-            <w:tcW w:type="dxa" w:w="2952"/>
-            <w:vAlign w:val="center"/>
-            <w:shd w:fill="F2F5F9"/>
-            <w:tcBorders>
-              <w:top w:val="single" w:sz="4" w:color="D9D9D9"/>
-              <w:left w:val="single" w:sz="4" w:color="D9D9D9"/>
-              <w:bottom w:val="single" w:sz="4" w:color="D9D9D9"/>
-              <w:right w:val="single" w:sz="4" w:color="D9D9D9"/>
-            </w:tcBorders>
-            <w:tcMar>
-              <w:top w:w="55" w:type="dxa"/>
-              <w:bottom w:w="55" w:type="dxa"/>
-              <w:left w:w="100" w:type="dxa"/>
-              <w:right w:w="100" w:type="dxa"/>
-            </w:tcMar>
-          </w:tcPr>
-          <w:p>
-            <w:pPr>
-              <w:spacing w:after="0" w:line="254" w:lineRule="auto"/>
+              <w:spacing w:after="0" w:line="252" w:lineRule="auto"/>
             </w:pPr>
             <w:r>
               <w:rPr>
@@ -646,25 +887,19 @@
         </w:tc>
         <w:tc>
           <w:tcPr>
-            <w:tcW w:type="dxa" w:w="6941"/>
+            <w:tcW w:type="dxa" w:w="7762"/>
             <w:vAlign w:val="center"/>
             <w:shd w:fill="F2F5F9"/>
-            <w:tcBorders>
-              <w:top w:val="single" w:sz="4" w:color="D9D9D9"/>
-              <w:left w:val="single" w:sz="4" w:color="D9D9D9"/>
-              <w:bottom w:val="single" w:sz="4" w:color="D9D9D9"/>
-              <w:right w:val="single" w:sz="4" w:color="D9D9D9"/>
-            </w:tcBorders>
             <w:tcMar>
-              <w:top w:w="55" w:type="dxa"/>
-              <w:bottom w:w="55" w:type="dxa"/>
+              <w:top w:w="65" w:type="dxa"/>
+              <w:bottom w:w="65" w:type="dxa"/>
               <w:left w:w="100" w:type="dxa"/>
               <w:right w:w="100" w:type="dxa"/>
             </w:tcMar>
           </w:tcPr>
           <w:p>
             <w:pPr>
-              <w:spacing w:after="0" w:line="254" w:lineRule="auto"/>
+              <w:spacing w:after="0" w:line="252" w:lineRule="auto"/>
             </w:pPr>
             <w:r>
               <w:rPr>
@@ -673,7 +908,7 @@
                 <w:color w:val="000000"/>
                 <w:sz w:val="18"/>
               </w:rPr>
-              <w:t>Пункт 5 главного меню; укажите outputs/exam-center/from_database.xlsx. Файл будет содержать три листа.</w:t>
+              <w:t>Пункт 5 главного меню создаёт Excel через XlsxExporter: три листа с данными из PostgreSQL.</w:t>
             </w:r>
           </w:p>
         </w:tc>
@@ -684,25 +919,19 @@
         </w:trPr>
         <w:tc>
           <w:tcPr>
-            <w:tcW w:type="dxa" w:w="2952"/>
+            <w:tcW w:type="dxa" w:w="2232"/>
             <w:vAlign w:val="center"/>
             <w:shd w:fill="FFFFFF"/>
-            <w:tcBorders>
-              <w:top w:val="single" w:sz="4" w:color="D9D9D9"/>
-              <w:left w:val="single" w:sz="4" w:color="D9D9D9"/>
-              <w:bottom w:val="single" w:sz="4" w:color="D9D9D9"/>
-              <w:right w:val="single" w:sz="4" w:color="D9D9D9"/>
-            </w:tcBorders>
             <w:tcMar>
-              <w:top w:w="55" w:type="dxa"/>
-              <w:bottom w:w="55" w:type="dxa"/>
+              <w:top w:w="65" w:type="dxa"/>
+              <w:bottom w:w="65" w:type="dxa"/>
               <w:left w:w="100" w:type="dxa"/>
               <w:right w:w="100" w:type="dxa"/>
             </w:tcMar>
           </w:tcPr>
           <w:p>
             <w:pPr>
-              <w:spacing w:after="0" w:line="254" w:lineRule="auto"/>
+              <w:spacing w:after="0" w:line="252" w:lineRule="auto"/>
             </w:pPr>
             <w:r>
               <w:rPr>
@@ -711,31 +940,25 @@
                 <w:color w:val="000000"/>
                 <w:sz w:val="18"/>
               </w:rPr>
-              <w:t>Консольный интерфейс</w:t>
+              <w:t>Меню</w:t>
             </w:r>
           </w:p>
         </w:tc>
         <w:tc>
           <w:tcPr>
-            <w:tcW w:type="dxa" w:w="6941"/>
+            <w:tcW w:type="dxa" w:w="7762"/>
             <w:vAlign w:val="center"/>
             <w:shd w:fill="FFFFFF"/>
-            <w:tcBorders>
-              <w:top w:val="single" w:sz="4" w:color="D9D9D9"/>
-              <w:left w:val="single" w:sz="4" w:color="D9D9D9"/>
-              <w:bottom w:val="single" w:sz="4" w:color="D9D9D9"/>
-              <w:right w:val="single" w:sz="4" w:color="D9D9D9"/>
-            </w:tcBorders>
             <w:tcMar>
-              <w:top w:w="55" w:type="dxa"/>
-              <w:bottom w:w="55" w:type="dxa"/>
+              <w:top w:w="65" w:type="dxa"/>
+              <w:bottom w:w="65" w:type="dxa"/>
               <w:left w:w="100" w:type="dxa"/>
               <w:right w:w="100" w:type="dxa"/>
             </w:tcMar>
           </w:tcPr>
           <w:p>
             <w:pPr>
-              <w:spacing w:after="0" w:line="254" w:lineRule="auto"/>
+              <w:spacing w:after="0" w:line="252" w:lineRule="auto"/>
             </w:pPr>
             <w:r>
               <w:rPr>
@@ -744,7 +967,7 @@
                 <w:color w:val="000000"/>
                 <w:sz w:val="18"/>
               </w:rPr>
-              <w:t>Пункты 1–3 главного меню содержат CRUD, поиск, фильтры и сортировку своей сущности.</w:t>
+              <w:t>Пункты 1, 2 и 3 главного меню управляют своей сущностью; после операции меню не закрывается.</w:t>
             </w:r>
           </w:p>
         </w:tc>
@@ -755,12 +978,20 @@
         <w:pStyle w:val="Heading1"/>
       </w:pPr>
       <w:r>
-        <w:t>Сценарий участника 1 Кандидаты</w:t>
+        <w:t>Порядок показа для каждого участника</w:t>
       </w:r>
     </w:p>
     <w:p>
       <w:pPr>
-        <w:ind w:left="288" w:hanging="288"/>
+        <w:pStyle w:val="Heading2"/>
+      </w:pPr>
+      <w:r>
+        <w:t>Участник 1 Кандидаты</w:t>
+      </w:r>
+    </w:p>
+    <w:p>
+      <w:pPr>
+        <w:ind w:left="317" w:hanging="317"/>
       </w:pPr>
       <w:r>
         <w:rPr>
@@ -769,12 +1000,12 @@
         <w:t xml:space="preserve">1. </w:t>
       </w:r>
       <w:r>
-        <w:t>Открыть пункт 1, вывести список. Показать Applicant.java, ApplicantStatus.java, ApplicantService.java и ApplicantRepository.java.</w:t>
+        <w:t>Откройте главное меню 1. Покажите Applicant.java, ApplicantStatus.java, ApplicantService.java и ApplicantRepository.java.</w:t>
       </w:r>
     </w:p>
     <w:p>
       <w:pPr>
-        <w:ind w:left="288" w:hanging="288"/>
+        <w:ind w:left="317" w:hanging="317"/>
       </w:pPr>
       <w:r>
         <w:rPr>
@@ -783,12 +1014,12 @@
         <w:t xml:space="preserve">2. </w:t>
       </w:r>
       <w:r>
-        <w:t>Создать кандидата с уникальным email и статусом ACTIVE; записать выданный ID. Получить запись по ID и изменить телефон или статус.</w:t>
+        <w:t>Создайте кандидата с новым email. Запишите ID; получите его по ID, измените телефон и затем удалите. Для удаления берите кандидата без заявок.</w:t>
       </w:r>
     </w:p>
     <w:p>
       <w:pPr>
-        <w:ind w:left="288" w:hanging="288"/>
+        <w:ind w:left="317" w:hanging="317"/>
       </w:pPr>
       <w:r>
         <w:rPr>
@@ -797,12 +1028,12 @@
         <w:t xml:space="preserve">3. </w:t>
       </w:r>
       <w:r>
-        <w:t>Найти по ФИО, отфильтровать по статусу и домену email. Отсортировать по ФИО прямо и обратно; при необходимости показать сортировку по email.</w:t>
+        <w:t>Покажите два фильтра: статус и домен email. Запустите сортировку по ФИО и email; у каждой выберите сначала 1, затем 2.</w:t>
       </w:r>
     </w:p>
     <w:p>
       <w:pPr>
-        <w:ind w:left="288" w:hanging="288"/>
+        <w:ind w:left="317" w:hanging="317"/>
       </w:pPr>
       <w:r>
         <w:rPr>
@@ -811,20 +1042,20 @@
         <w:t xml:space="preserve">4. </w:t>
       </w:r>
       <w:r>
-        <w:t>Показать ошибку на несуществующем ID или повторном email. Удалить созданного кандидата, пока у него нет заявок.</w:t>
+        <w:t>Введите неизвестный ID. Объясните: сервис создаёт ApplicantException, меню печатает ошибку и продолжает работу.</w:t>
       </w:r>
     </w:p>
     <w:p>
       <w:pPr>
-        <w:pStyle w:val="Heading1"/>
+        <w:pStyle w:val="Heading2"/>
       </w:pPr>
       <w:r>
-        <w:t>Сценарий участника 2 Заявки</w:t>
+        <w:t>Участник 2 Заявки</w:t>
       </w:r>
     </w:p>
     <w:p>
       <w:pPr>
-        <w:ind w:left="288" w:hanging="288"/>
+        <w:ind w:left="317" w:hanging="317"/>
       </w:pPr>
       <w:r>
         <w:rPr>
@@ -833,12 +1064,12 @@
         <w:t xml:space="preserve">1. </w:t>
       </w:r>
       <w:r>
-        <w:t>Открыть пункт 2, вывести список. Показать ExamApplication.java, ApplicationStatus.java, ExamApplicationService.java и ExamApplicationRepository.java.</w:t>
+        <w:t>Откройте главное меню 2. Покажите ExamApplication.java, ApplicationStatus.java, ExamApplicationService.java и ExamApplicationRepository.java.</w:t>
       </w:r>
     </w:p>
     <w:p>
       <w:pPr>
-        <w:ind w:left="288" w:hanging="288"/>
+        <w:ind w:left="317" w:hanging="317"/>
       </w:pPr>
       <w:r>
         <w:rPr>
@@ -847,12 +1078,12 @@
         <w:t xml:space="preserve">2. </w:t>
       </w:r>
       <w:r>
-        <w:t>Взять ID существующего активного кандидата. Создать заявку на будущую дату, получить по ID и изменить название или дату.</w:t>
+        <w:t>Возьмите ID активного кандидата и создайте заявку на будущую дату. Запишите ID заявки, получите её по ID и измените название или дату.</w:t>
       </w:r>
     </w:p>
     <w:p>
       <w:pPr>
-        <w:ind w:left="288" w:hanging="288"/>
+        <w:ind w:left="317" w:hanging="317"/>
       </w:pPr>
       <w:r>
         <w:rPr>
@@ -861,12 +1092,12 @@
         <w:t xml:space="preserve">3. </w:t>
       </w:r>
       <w:r>
-        <w:t>Найти по экзамену и ФИО кандидата; отфильтровать по статусу и диапазону дат; отсортировать по дате прямо и обратно.</w:t>
+        <w:t>Покажите фильтры по статусу и диапазону дат. Для сортировки даты выберите 13 → 1 и 13 → 2; для ФИО выберите 14 → 1 и 14 → 2.</w:t>
       </w:r>
     </w:p>
     <w:p>
       <w:pPr>
-        <w:ind w:left="288" w:hanging="288"/>
+        <w:ind w:left="317" w:hanging="317"/>
       </w:pPr>
       <w:r>
         <w:rPr>
@@ -875,20 +1106,20 @@
         <w:t xml:space="preserve">4. </w:t>
       </w:r>
       <w:r>
-        <w:t>Согласовать заявку, затем отменить или удалить тестовую запись. Показать ошибку на прошедшей дате, дубликате или запрещённом переходе статуса.</w:t>
+        <w:t>Покажите сообщение об ошибке на неизвестном ID или прошедшей дате. Удалите созданную тестовую заявку.</w:t>
       </w:r>
     </w:p>
     <w:p>
       <w:pPr>
-        <w:pStyle w:val="Heading1"/>
+        <w:pStyle w:val="Heading2"/>
       </w:pPr>
       <w:r>
-        <w:t>Сценарий участника 3 Экзаменаторы</w:t>
+        <w:t>Участник 3 Экзаменаторы</w:t>
       </w:r>
     </w:p>
     <w:p>
       <w:pPr>
-        <w:ind w:left="288" w:hanging="288"/>
+        <w:ind w:left="317" w:hanging="317"/>
       </w:pPr>
       <w:r>
         <w:rPr>
@@ -897,12 +1128,12 @@
         <w:t xml:space="preserve">1. </w:t>
       </w:r>
       <w:r>
-        <w:t>Открыть пункт 3, вывести список. Показать Examiner.java, ExaminerStatus.java, ExaminerService.java и ExaminerRepository.java.</w:t>
+        <w:t>Откройте главное меню 3. Покажите Examiner.java, ExaminerStatus.java, ExaminerService.java и ExaminerRepository.java.</w:t>
       </w:r>
     </w:p>
     <w:p>
       <w:pPr>
-        <w:ind w:left="288" w:hanging="288"/>
+        <w:ind w:left="317" w:hanging="317"/>
       </w:pPr>
       <w:r>
         <w:rPr>
@@ -911,12 +1142,12 @@
         <w:t xml:space="preserve">2. </w:t>
       </w:r>
       <w:r>
-        <w:t>Создать экзаменатора с уникальным email, получить по ID, изменить предмет или статус.</w:t>
+        <w:t>Создайте экзаменатора с новым email; получите по ID, измените предмет или статус и затем удалите.</w:t>
       </w:r>
     </w:p>
     <w:p>
       <w:pPr>
-        <w:ind w:left="288" w:hanging="288"/>
+        <w:ind w:left="317" w:hanging="317"/>
       </w:pPr>
       <w:r>
         <w:rPr>
@@ -925,12 +1156,12 @@
         <w:t xml:space="preserve">3. </w:t>
       </w:r>
       <w:r>
-        <w:t>Найти по ФИО, отфильтровать по статусу и предмету. Отсортировать по предмету прямо и обратно; при необходимости — по ФИО.</w:t>
+        <w:t>Покажите фильтры по статусу и предмету. Отсортируйте по ФИО и предмету; у каждого ключа покажите порядок 1 и 2.</w:t>
       </w:r>
     </w:p>
     <w:p>
       <w:pPr>
-        <w:ind w:left="288" w:hanging="288"/>
+        <w:ind w:left="317" w:hanging="317"/>
       </w:pPr>
       <w:r>
         <w:rPr>
@@ -939,7 +1170,170 @@
         <w:t xml:space="preserve">4. </w:t>
       </w:r>
       <w:r>
-        <w:t>Показать ошибку на повторном email или неизвестном ID. Удалить созданного экзаменатора.</w:t>
+        <w:t>Введите неизвестный ID или повторный email и объясните ExaminerException.</w:t>
+      </w:r>
+    </w:p>
+    <w:p>
+      <w:pPr>
+        <w:pStyle w:val="Heading1"/>
+        <w:pageBreakBefore/>
+      </w:pPr>
+      <w:r>
+        <w:t>Короткие ответы на дополнительные вопросы</w:t>
+      </w:r>
+    </w:p>
+    <w:p>
+      <w:r>
+        <w:rPr>
+          <w:b/>
+        </w:rPr>
+        <w:t xml:space="preserve">Что такое CRUD? </w:t>
+      </w:r>
+      <w:r>
+        <w:t>Create — INSERT, Read — SELECT, Update — UPDATE, Delete — DELETE. Меню обращается к сервису, сервис — к репозиторию, репозиторий — к таблице БД.</w:t>
+      </w:r>
+    </w:p>
+    <w:p>
+      <w:r>
+        <w:rPr>
+          <w:b/>
+        </w:rPr>
+        <w:t xml:space="preserve">Зачем PreparedStatement? </w:t>
+      </w:r>
+      <w:r>
+        <w:t>SQL содержит знаки ?, а значения передаются отдельно через setString, setLong и другие методы. Это безопаснее и понятнее, чем собирать SQL из пользовательского текста.</w:t>
+      </w:r>
+    </w:p>
+    <w:p>
+      <w:r>
+        <w:rPr>
+          <w:b/>
+        </w:rPr>
+        <w:t xml:space="preserve">Что делает конструктор модели? </w:t>
+      </w:r>
+      <w:r>
+        <w:t>Он создаёт объект сразу со всеми значениями. Репозиторий читает строку из ResultSet и передаёт её данные в конструктор, чтобы получить Applicant, ExamApplication или Examiner.</w:t>
+      </w:r>
+    </w:p>
+    <w:p>
+      <w:r>
+        <w:rPr>
+          <w:b/>
+        </w:rPr>
+        <w:t xml:space="preserve">Почему SQL находится в репозитории? </w:t>
+      </w:r>
+      <w:r>
+        <w:t>Сервис формулирует правило, например «дата должна быть будущей», а репозиторий знает, в какую таблицу и каким SQL сохранить запись. Так преподавателю легко увидеть каждый слой отдельно.</w:t>
+      </w:r>
+    </w:p>
+    <w:p>
+      <w:r>
+        <w:rPr>
+          <w:b/>
+        </w:rPr>
+        <w:t xml:space="preserve">Какие статусы бывают у заявки? </w:t>
+      </w:r>
+      <w:r>
+        <w:t>NEW — новая, APPROVED — согласованная, COMPLETED — завершённая, CANCELLED — отменённая. Из NEW можно перейти в APPROVED или CANCELLED; из APPROVED — в COMPLETED или CANCELLED.</w:t>
+      </w:r>
+    </w:p>
+    <w:p>
+      <w:r>
+        <w:rPr>
+          <w:b/>
+        </w:rPr>
+        <w:t xml:space="preserve">Когда ставится балл? </w:t>
+      </w:r>
+      <w:r>
+        <w:t>Только при завершении экзамена, после назначенного времени. Балл должен быть от 0 до 100. У незавершённой заявки score равен null.</w:t>
+      </w:r>
+    </w:p>
+    <w:p>
+      <w:r>
+        <w:rPr>
+          <w:b/>
+        </w:rPr>
+        <w:t xml:space="preserve">Как связаны таблицы? </w:t>
+      </w:r>
+      <w:r>
+        <w:t>exam_applications.applicant_id ссылается на applicants.id. Один кандидат может иметь несколько заявок. Экзаменаторы хранятся отдельным справочником; назначение на заявку в этой КР не требуется.</w:t>
+      </w:r>
+    </w:p>
+    <w:p>
+      <w:r>
+        <w:rPr>
+          <w:b/>
+        </w:rPr>
+        <w:t xml:space="preserve">Какие ограничения есть в базе? </w:t>
+      </w:r>
+      <w:r>
+        <w:t>PRIMARY KEY задаёт уникальный ID, FOREIGN KEY связывает заявку с кандидатом, UNIQUE не даёт повторить email, NOT NULL запрещает пустые обязательные поля, CHECK ограничивает статусы и балл.</w:t>
+      </w:r>
+    </w:p>
+    <w:p>
+      <w:r>
+        <w:rPr>
+          <w:b/>
+        </w:rPr>
+        <w:t xml:space="preserve">Зачем интерфейс DataExporter? </w:t>
+      </w:r>
+      <w:r>
+        <w:t>Переменная в меню имеет тип DataExporter, а объект — XlsxExporter. Вызов export() выполняет реализацию объекта; это пример полиморфизма.</w:t>
+      </w:r>
+    </w:p>
+    <w:p>
+      <w:r>
+        <w:rPr>
+          <w:b/>
+        </w:rPr>
+        <w:t xml:space="preserve">Чем фильтрация отличается от сортировки? </w:t>
+      </w:r>
+      <w:r>
+        <w:t>Фильтр уменьшает список: например, оставляет только APPROVED. Сортировка сохраняет те же записи, но меняет их порядок: от ранней даты к поздней или обратно.</w:t>
+      </w:r>
+    </w:p>
+    <w:p>
+      <w:r>
+        <w:rPr>
+          <w:b/>
+        </w:rPr>
+        <w:t xml:space="preserve">Где используются коллекции? </w:t>
+      </w:r>
+      <w:r>
+        <w:t>Метод allApplications() возвращает List&lt;ExamApplication&gt;. Сервис применяет stream().filter() для отбора и sorted() с Comparator для порядка; reversed() переворачивает компаратор.</w:t>
+      </w:r>
+    </w:p>
+    <w:p>
+      <w:r>
+        <w:rPr>
+          <w:b/>
+        </w:rPr>
+        <w:t xml:space="preserve">Где исключения? </w:t>
+      </w:r>
+      <w:r>
+        <w:t>ApplicantException, ApplicationException и ExaminerException объявлены в своих сервисах. Они сообщают о нарушенных правилах. ConsoleUi перехватывает их и выводит причину.</w:t>
+      </w:r>
+    </w:p>
+    <w:p>
+      <w:r>
+        <w:rPr>
+          <w:b/>
+        </w:rPr>
+        <w:t xml:space="preserve">Чем ошибка правила отличается от SQLException? </w:t>
+      </w:r>
+      <w:r>
+        <w:t>Свои исключения означают понятную пользователю проблему, например неизвестный ID. SQLException сообщает о проблеме на уровне SQL или подключения к PostgreSQL; меню обрабатывает её отдельно.</w:t>
+      </w:r>
+    </w:p>
+    <w:p>
+      <w:r>
+        <w:rPr>
+          <w:b/>
+        </w:rPr>
+        <w:t xml:space="preserve">Что показать в Excel? </w:t>
+      </w:r>
+      <w:r>
+        <w:t>Выберите пункт 5 главного меню, укажите outputs/exam-center/from_database.xlsx и откройте три листа: «Кандидаты», «Заявки», «Экзаменаторы».</w:t>
       </w:r>
     </w:p>
     <w:p>
@@ -947,117 +1341,18 @@
         <w:pStyle w:val="Heading1"/>
       </w:pPr>
       <w:r>
-        <w:t>Короткие ответы на типовые вопросы</w:t>
-      </w:r>
-    </w:p>
-    <w:p>
-      <w:pPr>
-        <w:pStyle w:val="Heading2"/>
-      </w:pPr>
-      <w:r>
-        <w:t>Почему это многослойная архитектура</w:t>
+        <w:t>Перед защитой</w:t>
       </w:r>
     </w:p>
     <w:p>
       <w:r>
-        <w:t>ConsoleUi отвечает только за взаимодействие с человеком; сервисы — за правила; репозитории — за SQL. Поэтому правила остаются в Java, а не прячутся в меню или базе.</w:t>
-      </w:r>
-    </w:p>
-    <w:p>
-      <w:pPr>
-        <w:pStyle w:val="Heading2"/>
-      </w:pPr>
-      <w:r>
-        <w:t>Что такое инкапсуляция и полиморфизм здесь</w:t>
-      </w:r>
-    </w:p>
-    <w:p>
-      <w:r>
-        <w:t>Поля моделей private; доступ к ним идёт через геттеры и сеттеры. Переменная exporter имеет тип интерфейса DataExporter, а реальный объект — XlsxExporter. Вызов export выполняет реализацию этого объекта.</w:t>
-      </w:r>
-    </w:p>
-    <w:p>
-      <w:pPr>
-        <w:pStyle w:val="Heading2"/>
-      </w:pPr>
-      <w:r>
-        <w:t>Зачем enum и исключения</w:t>
-      </w:r>
-    </w:p>
-    <w:p>
-      <w:r>
-        <w:t>Enum ограничивает статусы: нельзя произвольно записать неизвестный статус. Каждый сервис создаёт своё исключение при нарушении правила или отсутствии ID; меню перехватывает его и продолжает работу.</w:t>
-      </w:r>
-    </w:p>
-    <w:p>
-      <w:pPr>
-        <w:pStyle w:val="Heading2"/>
-      </w:pPr>
-      <w:r>
-        <w:t>Как работают коллекции, фильтры и сортировки</w:t>
-      </w:r>
-    </w:p>
-    <w:p>
-      <w:r>
-        <w:t>Репозиторий возвращает List объектов. Сервис применяет Stream API, filter и Comparator. Параметр ascending выбирает прямой порядок или reversed() для обратного.</w:t>
-      </w:r>
-    </w:p>
-    <w:p>
-      <w:pPr>
-        <w:pStyle w:val="Heading2"/>
-      </w:pPr>
-      <w:r>
-        <w:t>Что делает JDBC и чем PreparedStatement отличается от Statement</w:t>
-      </w:r>
-    </w:p>
-    <w:p>
-      <w:r>
-        <w:t>JDBC соединяет Java с PostgreSQL. PreparedStatement хранит SQL с параметрами ?, значения передаются методами setString, setLong и другими. Обычный Statement выполняет готовую SQL-строку; в этом проекте используется только его константа RETURN_GENERATED_KEYS для получения нового ID. try-with-resources закрывает соединение и результаты.</w:t>
-      </w:r>
-    </w:p>
-    <w:p>
-      <w:pPr>
-        <w:pStyle w:val="Heading2"/>
-      </w:pPr>
-      <w:r>
-        <w:t>Как связаны таблицы и какие правила защищают данные</w:t>
-      </w:r>
-    </w:p>
-    <w:p>
-      <w:r>
-        <w:t>exam_applications.applicant_id — внешний ключ на applicants.id. Один кандидат может иметь много заявок; несуществующий кандидат недопустим. PRIMARY KEY, UNIQUE, NOT NULL и CHECK проверяются PostgreSQL. Сервис дополнительно проверяет существование и статус кандидата, дату, дубликаты, переходы статуса и балл.</w:t>
-      </w:r>
-    </w:p>
-    <w:p>
-      <w:pPr>
-        <w:pStyle w:val="Heading2"/>
-      </w:pPr>
-      <w:r>
-        <w:t>Как работает экспорт</w:t>
-      </w:r>
-    </w:p>
-    <w:p>
-      <w:r>
-        <w:t>Меню запрашивает свежие списки из сервисов и передаёт их XlsxExporter через DataExporter. Apache POI создаёт книгу с листами «Кандидаты», «Заявки» и «Экзаменаторы». Для демонстрации выберите пункт 5 и откройте готовый .xlsx.</w:t>
-      </w:r>
-    </w:p>
-    <w:p>
-      <w:pPr>
-        <w:pStyle w:val="Heading1"/>
-      </w:pPr>
-      <w:r>
-        <w:t>Перед входом в аудиторию</w:t>
-      </w:r>
-    </w:p>
-    <w:p>
-      <w:r>
-        <w:t>Запустите ./run.sh, убедитесь, что меню открывается. В папке проекта должны быть pom.xml, sql/schema.sql, docs/er-diagram.svg и outputs/exam-center/from_database.xlsx. Для быстрой проверки работы можно запустить IntegrationSmoke; успешный итог — THREE ENTITY INTEGRATION PASSED.</w:t>
+        <w:t>Запустите ./run.sh и убедитесь, что появилось главное меню. Откройте сначала список записей в каждом разделе, чтобы увидеть реальные ID. Новым записям задавайте уникальные email. Дата новой заявки должна быть в будущем. После показа экспортируйте Excel и откройте ER-диаграмму docs/er-diagram.svg.</w:t>
       </w:r>
     </w:p>
     <w:sectPr>
       <w:footerReference w:type="default" r:id="rId9"/>
       <w:pgSz w:w="12240" w:h="15840"/>
-      <w:pgMar w:top="893" w:right="1152" w:bottom="835" w:left="1152" w:header="720" w:footer="720" w:gutter="0"/>
+      <w:pgMar w:top="1008" w:right="1123" w:bottom="936" w:left="1123" w:header="720" w:footer="720" w:gutter="0"/>
       <w:cols w:space="720"/>
       <w:docGrid w:linePitch="360"/>
     </w:sectPr>
@@ -1449,7 +1744,7 @@
     <w:qFormat/>
     <w:rsid w:val="00FC693F"/>
     <w:pPr>
-      <w:spacing w:line="259" w:lineRule="auto" w:after="80"/>
+      <w:spacing w:line="269" w:lineRule="auto" w:after="120"/>
     </w:pPr>
     <w:rPr>
       <w:rFonts w:ascii="Arial" w:hAnsi="Arial" w:eastAsia="Arial" w:cs="Arial"/>
@@ -1513,7 +1808,7 @@
     <w:pPr>
       <w:keepNext/>
       <w:keepLines/>
-      <w:spacing w:before="180" w:after="80"/>
+      <w:spacing w:before="220" w:after="80"/>
       <w:outlineLvl w:val="0"/>
     </w:pPr>
     <w:rPr>
@@ -1521,7 +1816,7 @@
       <w:b/>
       <w:bCs/>
       <w:color w:val="000000"/>
-      <w:sz w:val="27"/>
+      <w:sz w:val="26"/>
       <w:szCs w:val="28"/>
     </w:rPr>
   </w:style>
@@ -1537,7 +1832,7 @@
     <w:pPr>
       <w:keepNext/>
       <w:keepLines/>
-      <w:spacing w:before="120" w:after="80"/>
+      <w:spacing w:before="140" w:after="80"/>
       <w:outlineLvl w:val="1"/>
     </w:pPr>
     <w:rPr>
@@ -1799,7 +2094,7 @@
     <w:qFormat/>
     <w:rsid w:val="00FC693F"/>
     <w:pPr>
-      <w:spacing w:after="200" w:line="240" w:lineRule="auto"/>
+      <w:spacing w:after="180" w:line="240" w:lineRule="auto"/>
       <w:contextualSpacing/>
       <w:pBdr>
         <w:bottom w:val="nil"/>

</xml_diff>

<commit_message>
Add file-by-file defense walkthrough
</commit_message>
<xml_diff>
--- a/Ответы к защите Экзаменационный центр.docx
+++ b/Ответы к защите Экзаменационный центр.docx
@@ -1349,6 +1349,340 @@
         <w:t>Запустите ./run.sh и убедитесь, что появилось главное меню. Откройте сначала список записей в каждом разделе, чтобы увидеть реальные ID. Новым записям задавайте уникальные email. Дата новой заявки должна быть в будущем. После показа экспортируйте Excel и откройте ER-диаграмму docs/er-diagram.svg.</w:t>
       </w:r>
     </w:p>
+    <w:p>
+      <w:pPr>
+        <w:pStyle w:val="Heading1"/>
+        <w:pageBreakBefore/>
+      </w:pPr>
+      <w:r>
+        <w:t>Что именно показывать в файлах кандидата</w:t>
+      </w:r>
+    </w:p>
+    <w:p>
+      <w:r>
+        <w:t>Открыть четыре файла — значит показать четыре разные обязанности. Не нужно читать весь код вслух. Покажите указанные строки, объясните их одним предложением и свяжите с действием в консоли.</w:t>
+      </w:r>
+    </w:p>
+    <w:p>
+      <w:pPr>
+        <w:pStyle w:val="Heading2"/>
+      </w:pPr>
+      <w:r>
+        <w:t>Первый файл Applicant.java</w:t>
+      </w:r>
+    </w:p>
+    <w:p>
+      <w:r>
+        <w:rPr>
+          <w:b/>
+        </w:rPr>
+        <w:t xml:space="preserve">Поля и смысл. </w:t>
+      </w:r>
+      <w:r>
+        <w:t>Строки 3–8: класс Applicant описывает одного кандидата. id — номер записи, fullName — ФИО, email и phone — контакты, status — его состояние. Поля private: другой код получает их через методы класса.</w:t>
+      </w:r>
+    </w:p>
+    <w:p>
+      <w:r>
+        <w:rPr>
+          <w:b/>
+        </w:rPr>
+        <w:t xml:space="preserve">Конструктор. </w:t>
+      </w:r>
+      <w:r>
+        <w:t>Строки 10–16: new Applicant(...) создаёт объект и заполняет пять полей. Репозиторий так превращает строку из PostgreSQL в Java-объект.</w:t>
+      </w:r>
+    </w:p>
+    <w:p>
+      <w:r>
+        <w:rPr>
+          <w:b/>
+        </w:rPr>
+        <w:t xml:space="preserve">Геттеры и сеттеры. </w:t>
+      </w:r>
+      <w:r>
+        <w:t>Строки 18–27: getFullName() читает ФИО, setFullName(...) меняет его в объекте. Точно такие пары есть у остальных полей. Сеттер не сохраняет изменение в базу; запись в БД меняет метод update репозитория.</w:t>
+      </w:r>
+    </w:p>
+    <w:p>
+      <w:r>
+        <w:rPr>
+          <w:b/>
+        </w:rPr>
+        <w:t xml:space="preserve">Если спросят про final. </w:t>
+      </w:r>
+      <w:r>
+        <w:t>final стоит перед class: класс нельзя наследовать. Поля внутри не final, поэтому сеттеры допустимы.</w:t>
+      </w:r>
+    </w:p>
+    <w:p>
+      <w:pPr>
+        <w:pStyle w:val="Heading2"/>
+      </w:pPr>
+      <w:r>
+        <w:t>Второй файл ApplicantStatus.java</w:t>
+      </w:r>
+    </w:p>
+    <w:p>
+      <w:r>
+        <w:rPr>
+          <w:b/>
+        </w:rPr>
+        <w:t xml:space="preserve">Что показать. </w:t>
+      </w:r>
+      <w:r>
+        <w:t>Строки 3–4: enum разрешает только ACTIVE и BLOCKED. Это тип поля status модели; нельзя передать произвольный текст вместо одного из двух значений.</w:t>
+      </w:r>
+    </w:p>
+    <w:p>
+      <w:r>
+        <w:rPr>
+          <w:b/>
+        </w:rPr>
+        <w:t xml:space="preserve">Зачем нужно правило. </w:t>
+      </w:r>
+      <w:r>
+        <w:t>ACTIVE означает, что кандидат может записываться на экзамен. Для BLOCKED сервис заявок отклоняет новую заявку. В репозитории status.name() записывает имя статуса в PostgreSQL, а valueOf(...) читает обратно.</w:t>
+      </w:r>
+    </w:p>
+    <w:p>
+      <w:pPr>
+        <w:pStyle w:val="Heading2"/>
+      </w:pPr>
+      <w:r>
+        <w:t>Третий файл ApplicantService.java</w:t>
+      </w:r>
+    </w:p>
+    <w:p>
+      <w:r>
+        <w:rPr>
+          <w:b/>
+        </w:rPr>
+        <w:t xml:space="preserve">Где логика. </w:t>
+      </w:r>
+      <w:r>
+        <w:t>Строки 18–20: сервис хранит ссылку на ApplicantRepository. Он вызывает репозиторий, но сам SQL не пишет.</w:t>
+      </w:r>
+    </w:p>
+    <w:p>
+      <w:r>
+        <w:rPr>
+          <w:b/>
+        </w:rPr>
+        <w:t xml:space="preserve">CRUD. </w:t>
+      </w:r>
+      <w:r>
+        <w:t>Строки 22–46: createApplicant создаёт, getApplicant получает по ID, allApplicants выводит список, updateApplicant меняет, deleteApplicant удаляет. Перед удалением проверяется, что у кандидата нет заявок.</w:t>
+      </w:r>
+    </w:p>
+    <w:p>
+      <w:r>
+        <w:rPr>
+          <w:b/>
+        </w:rPr>
+        <w:t xml:space="preserve">Правила и ошибки. </w:t>
+      </w:r>
+      <w:r>
+        <w:t>Строки 14–16 объявляют ApplicantException. В строках 49–64 validate проверяет длину ФИО, email, телефон, статус и уникальность email; ошибка создаёт исключение с понятным текстом. Отсутствующий ID тоже вызывает ApplicantException.</w:t>
+      </w:r>
+    </w:p>
+    <w:p>
+      <w:r>
+        <w:rPr>
+          <w:b/>
+        </w:rPr>
+        <w:t xml:space="preserve">Фильтры и сортировки. </w:t>
+      </w:r>
+      <w:r>
+        <w:t>Строки 66–83 ищут по ФИО и фильтруют по статусу или домену email. Строки 85–96 сортируют по ФИО и email. true выбирает прямой порядок, false — обратный через reversed().</w:t>
+      </w:r>
+    </w:p>
+    <w:p>
+      <w:pPr>
+        <w:pStyle w:val="Heading2"/>
+      </w:pPr>
+      <w:r>
+        <w:t>Четвёртый файл ApplicantRepository.java</w:t>
+      </w:r>
+    </w:p>
+    <w:p>
+      <w:r>
+        <w:rPr>
+          <w:b/>
+        </w:rPr>
+        <w:t xml:space="preserve">Создание. </w:t>
+      </w:r>
+      <w:r>
+        <w:t>Строки 16–30: строка INSERT добавляет кандидата в таблицу applicants. Знаки ? получают значения через setString; getGeneratedKeys возвращает созданный ID.</w:t>
+      </w:r>
+    </w:p>
+    <w:p>
+      <w:r>
+        <w:rPr>
+          <w:b/>
+        </w:rPr>
+        <w:t xml:space="preserve">Чтение и изменение. </w:t>
+      </w:r>
+      <w:r>
+        <w:t>Строки 32–52: SELECT получает одну запись или список; map в строках 95–99 собирает объект Applicant из ResultSet. Строки 54–74 содержат UPDATE и DELETE.</w:t>
+      </w:r>
+    </w:p>
+    <w:p>
+      <w:r>
+        <w:rPr>
+          <w:b/>
+        </w:rPr>
+        <w:t xml:space="preserve">Защита данных. </w:t>
+      </w:r>
+      <w:r>
+        <w:t>Строки 76–93 проверяют повторный email и наличие заявок. Database.connect() открывает соединение с PostgreSQL; try-with-resources закрывает Connection, PreparedStatement и ResultSet.</w:t>
+      </w:r>
+    </w:p>
+    <w:p>
+      <w:pPr>
+        <w:pStyle w:val="Heading2"/>
+        <w:pageBreakBefore/>
+      </w:pPr>
+      <w:r>
+        <w:t>Как связать четыре файла одним примером</w:t>
+      </w:r>
+    </w:p>
+    <w:p>
+      <w:r>
+        <w:t>Выберите в меню «Кандидаты → Создать». ConsoleUi читает ФИО, email, телефон и статус и вызывает ApplicantService.createApplicant(). Сервис проверяет значения и вызывает ApplicantRepository.create(). Репозиторий выполняет INSERT в таблицу applicants и возвращает новый ID. Меню печатает этот ID. Покажите затем «По ID», чтобы доказать, что запись сохранилась.</w:t>
+      </w:r>
+    </w:p>
+    <w:p>
+      <w:r>
+        <w:t>После этого покажите один фильтр и одну сортировку в консоли, затем найдите соответствующие методы в ApplicantService. Для собственной ошибки запросите несуществующий ID: getApplicant() выдаст ApplicantException, а ConsoleUi напечатает сообщение и продолжит работу.</w:t>
+      </w:r>
+    </w:p>
+    <w:p>
+      <w:pPr>
+        <w:pStyle w:val="Heading2"/>
+      </w:pPr>
+      <w:r>
+        <w:t>Что показать участнику с заявками</w:t>
+      </w:r>
+    </w:p>
+    <w:p>
+      <w:r>
+        <w:rPr>
+          <w:b/>
+        </w:rPr>
+        <w:t xml:space="preserve">ExamApplication.java. </w:t>
+      </w:r>
+      <w:r>
+        <w:t>Покажите поля applicantId, examName, scheduledAt, status и score, конструктор и пары геттеров/сеттеров. applicantId связывает заявку с кандидатом; scheduledAt хранит дату экзамена. final относится к классу, а не к полям.</w:t>
+      </w:r>
+    </w:p>
+    <w:p>
+      <w:r>
+        <w:rPr>
+          <w:b/>
+        </w:rPr>
+        <w:t xml:space="preserve">ApplicationStatus.java. </w:t>
+      </w:r>
+      <w:r>
+        <w:t>Назовите четыре значения: NEW, APPROVED, COMPLETED и CANCELLED. Объясните, что статус нельзя заменить случайной строкой; разрешённые переходы проверяет сервис.</w:t>
+      </w:r>
+    </w:p>
+    <w:p>
+      <w:r>
+        <w:rPr>
+          <w:b/>
+        </w:rPr>
+        <w:t xml:space="preserve">ExamApplicationService.java. </w:t>
+      </w:r>
+      <w:r>
+        <w:t>Покажите createApplication, getApplication, updateApplication, deleteApplication и changeStatus. При создании сервис проверяет активного кандидата, будущую дату и отсутствие активного дубликата. Ниже находятся фильтры и две сортировки: sortByDate и sortByApplicant; каждая принимает true или false.</w:t>
+      </w:r>
+    </w:p>
+    <w:p>
+      <w:r>
+        <w:rPr>
+          <w:b/>
+        </w:rPr>
+        <w:t xml:space="preserve">ExamApplicationRepository.java. </w:t>
+      </w:r>
+      <w:r>
+        <w:t>Найдите SQL для таблицы exam_applications и поле applicant_id. Оно ссылается на кандидата. Репозиторий получает и сохраняет данные через PreparedStatement, а сервис решает, допустима ли операция.</w:t>
+      </w:r>
+    </w:p>
+    <w:p>
+      <w:r>
+        <w:rPr>
+          <w:b/>
+        </w:rPr>
+        <w:t xml:space="preserve">Показ в меню. </w:t>
+      </w:r>
+      <w:r>
+        <w:t>Главное меню 2 → создайте заявку, получите по ID, измените и удалите. Для сортировки покажите 13 → 1/2 и 14 → 1/2. Для ошибки попробуйте прошедшую дату.</w:t>
+      </w:r>
+    </w:p>
+    <w:p>
+      <w:pPr>
+        <w:pStyle w:val="Heading2"/>
+      </w:pPr>
+      <w:r>
+        <w:t>Что показать участнику с экзаменаторами</w:t>
+      </w:r>
+    </w:p>
+    <w:p>
+      <w:r>
+        <w:rPr>
+          <w:b/>
+        </w:rPr>
+        <w:t xml:space="preserve">Examiner.java. </w:t>
+      </w:r>
+      <w:r>
+        <w:t>Покажите поля id, fullName, email, subject, status; конструктор и геттеры/сеттеры. subject — предмет экзаменатора. Сеттер меняет объект, а сохранение делает сервис через репозиторий.</w:t>
+      </w:r>
+    </w:p>
+    <w:p>
+      <w:r>
+        <w:rPr>
+          <w:b/>
+        </w:rPr>
+        <w:t xml:space="preserve">ExaminerStatus.java. </w:t>
+      </w:r>
+      <w:r>
+        <w:t>Покажите ACTIVE и INACTIVE. Это допустимые значения статуса сотрудника, а не свободный текст.</w:t>
+      </w:r>
+    </w:p>
+    <w:p>
+      <w:r>
+        <w:rPr>
+          <w:b/>
+        </w:rPr>
+        <w:t xml:space="preserve">ExaminerService.java. </w:t>
+      </w:r>
+      <w:r>
+        <w:t>Покажите CRUD, проверку ФИО, уникального email и предмета, собственное ExaminerException, два фильтра и две сортировки — по ФИО и предмету, каждая в обе стороны.</w:t>
+      </w:r>
+    </w:p>
+    <w:p>
+      <w:r>
+        <w:rPr>
+          <w:b/>
+        </w:rPr>
+        <w:t xml:space="preserve">ExaminerRepository.java. </w:t>
+      </w:r>
+      <w:r>
+        <w:t>Покажите SQL INSERT, SELECT, UPDATE, DELETE для таблицы examiners и передачу параметров через PreparedStatement. Полученная строка превращается в объект Examiner.</w:t>
+      </w:r>
+    </w:p>
+    <w:p>
+      <w:r>
+        <w:rPr>
+          <w:b/>
+        </w:rPr>
+        <w:t xml:space="preserve">Показ в меню. </w:t>
+      </w:r>
+      <w:r>
+        <w:t>Главное меню 3 → создайте экзаменатора, получите по ID, измените и удалите. Отфильтруйте по статусу и предмету, затем отсортируйте по ФИО и предмету. Для ошибки введите повторный email или неизвестный ID.</w:t>
+      </w:r>
+    </w:p>
     <w:sectPr>
       <w:footerReference w:type="default" r:id="rId9"/>
       <w:pgSz w:w="12240" w:h="15840"/>

</xml_diff>